<commit_message>
Handleiding uitgebreid + geïllustreerd met echte schermafbeeldingen
- Inhoud fors uitgebreid per rol (meer secties + gedetailleerde stappen) in
  src/content/help.ts; per sectie een schermafbeelding (img-veld).
- 11 echte screenshots (demo-data, NL) via scripts/gen-help-screenshots.mjs
  (puppeteer-core + Edge over CDP) → public/help/*.png, geoptimaliseerd (~1000px).
- In-app /app/help toont de screenshots inline onder elke sectie.
- Geïllustreerde PDF's (NL+EN) met ingebedde screenshots: docs/BugaWuga-
  handleiding-*.{docx,pdf}; in-app download → public/handleiding/handleiding-*.pdf.
- npm-scripts gen:help; puppeteer-core als devDep.

Live getest: 11 screenshots ingebed op de help-pagina, PDF + screenshots geven
200, download-link volgt de taal. Typecheck schoon.

Co-Authored-By: Claude Opus 4.8 <noreply@anthropic.com>
</commit_message>
<xml_diff>
--- a/docs/BugaWuga-handleiding-NL.docx
+++ b/docs/BugaWuga-handleiding-NL.docx
@@ -97,7 +97,7 @@
                 <w:sz w:val="20"/>
                 <w:szCs w:val="20"/>
               </w:rPr>
-              <w:t xml:space="preserve">Zo werkt BugaWuga — per profiel. Dit document bundelt alle rollen.</w:t>
+              <w:t xml:space="preserve">Zo werkt BugaWuga — met echte schermen, afgestemd op jouw rol.</w:t>
             </w:r>
           </w:p>
         </w:tc>
@@ -122,7 +122,7 @@
           <w:sz w:val="15"/>
           <w:szCs w:val="15"/>
         </w:rPr>
-        <w:t xml:space="preserve">ROL · VOOR IEDEREEN</w:t>
+        <w:t xml:space="preserve">VOOR IEDEREEN</w:t>
       </w:r>
     </w:p>
     <w:p>
@@ -155,12 +155,12 @@
           <w:sz w:val="20"/>
           <w:szCs w:val="20"/>
         </w:rPr>
-        <w:t xml:space="preserve">De basis die voor elk profiel geldt.</w:t>
-      </w:r>
-    </w:p>
-    <w:p>
-      <w:pPr>
-        <w:spacing w:after="40" w:before="140"/>
+        <w:t xml:space="preserve">De basis die voor elk profiel geldt. Begin hier.</w:t>
+      </w:r>
+    </w:p>
+    <w:p>
+      <w:pPr>
+        <w:spacing w:after="40" w:before="150"/>
       </w:pPr>
       <w:r>
         <w:rPr>
@@ -171,7 +171,7 @@
           <w:sz w:val="18"/>
           <w:szCs w:val="18"/>
         </w:rPr>
-        <w:t xml:space="preserve">Inloggen, taal &amp; weergave</w:t>
+        <w:t xml:space="preserve">Inloggen &amp; je startpagina</w:t>
       </w:r>
     </w:p>
     <w:p>
@@ -201,102 +201,147 @@
           <w:sz w:val="20"/>
           <w:szCs w:val="20"/>
         </w:rPr>
-        <w:t xml:space="preserve"> — met je e-mail en wachtwoord, of via de knop bovenaan.</w:t>
-      </w:r>
-    </w:p>
-    <w:p>
-      <w:pPr>
-        <w:pStyle w:val="ListParagraph"/>
-        <w:numPr>
-          <w:ilvl w:val="0"/>
-          <w:numId w:val="2"/>
-        </w:numPr>
-        <w:spacing w:after="20"/>
-      </w:pPr>
-      <w:r>
-        <w:rPr>
-          <w:rFonts w:ascii="Calibri" w:cs="Calibri" w:eastAsia="Calibri" w:hAnsi="Calibri"/>
-          <w:b/>
-          <w:bCs/>
-          <w:color w:val="23201A"/>
-          <w:sz w:val="20"/>
-          <w:szCs w:val="20"/>
-        </w:rPr>
-        <w:t xml:space="preserve">Taal</w:t>
-      </w:r>
-      <w:r>
-        <w:rPr>
-          <w:rFonts w:ascii="Calibri" w:cs="Calibri" w:eastAsia="Calibri" w:hAnsi="Calibri"/>
-          <w:color w:val="23201A"/>
-          <w:sz w:val="20"/>
-          <w:szCs w:val="20"/>
-        </w:rPr>
-        <w:t xml:space="preserve"> — kies uit Nederlands, Engels, Spaans, Portugees, Frans of Chinees.</w:t>
-      </w:r>
-    </w:p>
-    <w:p>
-      <w:pPr>
-        <w:pStyle w:val="ListParagraph"/>
-        <w:numPr>
-          <w:ilvl w:val="0"/>
-          <w:numId w:val="2"/>
-        </w:numPr>
-        <w:spacing w:after="20"/>
-      </w:pPr>
-      <w:r>
-        <w:rPr>
-          <w:rFonts w:ascii="Calibri" w:cs="Calibri" w:eastAsia="Calibri" w:hAnsi="Calibri"/>
-          <w:b/>
-          <w:bCs/>
-          <w:color w:val="23201A"/>
-          <w:sz w:val="20"/>
-          <w:szCs w:val="20"/>
-        </w:rPr>
-        <w:t xml:space="preserve">Thema</w:t>
-      </w:r>
-      <w:r>
-        <w:rPr>
-          <w:rFonts w:ascii="Calibri" w:cs="Calibri" w:eastAsia="Calibri" w:hAnsi="Calibri"/>
-          <w:color w:val="23201A"/>
-          <w:sz w:val="20"/>
-          <w:szCs w:val="20"/>
-        </w:rPr>
-        <w:t xml:space="preserve"> — één knop wisselt tussen licht, donker en automatisch.</w:t>
-      </w:r>
-    </w:p>
-    <w:p>
-      <w:pPr>
-        <w:pStyle w:val="ListParagraph"/>
-        <w:numPr>
-          <w:ilvl w:val="0"/>
-          <w:numId w:val="2"/>
-        </w:numPr>
-        <w:spacing w:after="20"/>
-      </w:pPr>
-      <w:r>
-        <w:rPr>
-          <w:rFonts w:ascii="Calibri" w:cs="Calibri" w:eastAsia="Calibri" w:hAnsi="Calibri"/>
-          <w:b/>
-          <w:bCs/>
-          <w:color w:val="23201A"/>
-          <w:sz w:val="20"/>
-          <w:szCs w:val="20"/>
-        </w:rPr>
-        <w:t xml:space="preserve">App installeren</w:t>
-      </w:r>
-      <w:r>
-        <w:rPr>
-          <w:rFonts w:ascii="Calibri" w:cs="Calibri" w:eastAsia="Calibri" w:hAnsi="Calibri"/>
-          <w:color w:val="23201A"/>
-          <w:sz w:val="20"/>
-          <w:szCs w:val="20"/>
-        </w:rPr>
-        <w:t xml:space="preserve"> — via de installeer-knop draai je BugaWuga als app op je telefoon of desktop.</w:t>
-      </w:r>
-    </w:p>
-    <w:p>
-      <w:pPr>
-        <w:spacing w:after="40" w:before="140"/>
+        <w:t xml:space="preserve"> — ga naar de website, klik op Inloggen en gebruik je e-mail + wachtwoord. Heb je nog geen account? Klik op “Account maken” en kies je rol (afzender of reiziger).</w:t>
+      </w:r>
+    </w:p>
+    <w:p>
+      <w:pPr>
+        <w:pStyle w:val="ListParagraph"/>
+        <w:numPr>
+          <w:ilvl w:val="0"/>
+          <w:numId w:val="2"/>
+        </w:numPr>
+        <w:spacing w:after="20"/>
+      </w:pPr>
+      <w:r>
+        <w:rPr>
+          <w:rFonts w:ascii="Calibri" w:cs="Calibri" w:eastAsia="Calibri" w:hAnsi="Calibri"/>
+          <w:b/>
+          <w:bCs/>
+          <w:color w:val="23201A"/>
+          <w:sz w:val="20"/>
+          <w:szCs w:val="20"/>
+        </w:rPr>
+        <w:t xml:space="preserve">Overzicht</w:t>
+      </w:r>
+      <w:r>
+        <w:rPr>
+          <w:rFonts w:ascii="Calibri" w:cs="Calibri" w:eastAsia="Calibri" w:hAnsi="Calibri"/>
+          <w:color w:val="23201A"/>
+          <w:sz w:val="20"/>
+          <w:szCs w:val="20"/>
+        </w:rPr>
+        <w:t xml:space="preserve"> — na het inloggen kom je op je Overzicht: je belangrijkste cijfers en je laatste zendingen/ritten in één blik.</w:t>
+      </w:r>
+    </w:p>
+    <w:p>
+      <w:pPr>
+        <w:pStyle w:val="ListParagraph"/>
+        <w:numPr>
+          <w:ilvl w:val="0"/>
+          <w:numId w:val="2"/>
+        </w:numPr>
+        <w:spacing w:after="20"/>
+      </w:pPr>
+      <w:r>
+        <w:rPr>
+          <w:rFonts w:ascii="Calibri" w:cs="Calibri" w:eastAsia="Calibri" w:hAnsi="Calibri"/>
+          <w:b/>
+          <w:bCs/>
+          <w:color w:val="23201A"/>
+          <w:sz w:val="20"/>
+          <w:szCs w:val="20"/>
+        </w:rPr>
+        <w:t xml:space="preserve">Menu links</w:t>
+      </w:r>
+      <w:r>
+        <w:rPr>
+          <w:rFonts w:ascii="Calibri" w:cs="Calibri" w:eastAsia="Calibri" w:hAnsi="Calibri"/>
+          <w:color w:val="23201A"/>
+          <w:sz w:val="20"/>
+          <w:szCs w:val="20"/>
+        </w:rPr>
+        <w:t xml:space="preserve"> — alle onderdelen staan in het menu aan de linkerkant (op de telefoon onderin). Een getal naast een item (bv. Berichten of Marktplaats) laat zien wat nieuw of open is.</w:t>
+      </w:r>
+    </w:p>
+    <w:p>
+      <w:pPr>
+        <w:pStyle w:val="ListParagraph"/>
+        <w:numPr>
+          <w:ilvl w:val="0"/>
+          <w:numId w:val="2"/>
+        </w:numPr>
+        <w:spacing w:after="20"/>
+      </w:pPr>
+      <w:r>
+        <w:rPr>
+          <w:rFonts w:ascii="Calibri" w:cs="Calibri" w:eastAsia="Calibri" w:hAnsi="Calibri"/>
+          <w:b/>
+          <w:bCs/>
+          <w:color w:val="23201A"/>
+          <w:sz w:val="20"/>
+          <w:szCs w:val="20"/>
+        </w:rPr>
+        <w:t xml:space="preserve">Je rol</w:t>
+      </w:r>
+      <w:r>
+        <w:rPr>
+          <w:rFonts w:ascii="Calibri" w:cs="Calibri" w:eastAsia="Calibri" w:hAnsi="Calibri"/>
+          <w:color w:val="23201A"/>
+          <w:sz w:val="20"/>
+          <w:szCs w:val="20"/>
+        </w:rPr>
+        <w:t xml:space="preserve"> — linksonder zie je je naam, je rol en of je account geverifieerd is (✓).</w:t>
+      </w:r>
+    </w:p>
+    <w:p>
+      <w:pPr>
+        <w:spacing w:after="140" w:before="60"/>
+      </w:pPr>
+      <w:r>
+        <w:drawing>
+          <wp:inline distT="0" distB="0" distL="0" distR="0">
+            <wp:extent cx="5334000" cy="3638550"/>
+            <wp:effectExtent t="0" r="0" b="0" l="0"/>
+            <wp:docPr id="1" name="" descr="" title=""/>
+            <wp:cNvGraphicFramePr>
+              <a:graphicFrameLocks xmlns:a="http://schemas.openxmlformats.org/drawingml/2006/main" noChangeAspect="1"/>
+            </wp:cNvGraphicFramePr>
+            <a:graphic xmlns:a="http://schemas.openxmlformats.org/drawingml/2006/main">
+              <a:graphicData uri="http://schemas.openxmlformats.org/drawingml/2006/picture">
+                <pic:pic xmlns:pic="http://schemas.openxmlformats.org/drawingml/2006/picture">
+                  <pic:nvPicPr>
+                    <pic:cNvPr id="0" name="" descr=""/>
+                    <pic:cNvPicPr>
+                      <a:picLocks noChangeAspect="1" noChangeArrowheads="1"/>
+                    </pic:cNvPicPr>
+                  </pic:nvPicPr>
+                  <pic:blipFill>
+                    <a:blip r:embed="rId7" cstate="none"/>
+                    <a:srcRect/>
+                    <a:stretch>
+                      <a:fillRect/>
+                    </a:stretch>
+                  </pic:blipFill>
+                  <pic:spPr bwMode="auto">
+                    <a:xfrm>
+                      <a:off x="0" y="0"/>
+                      <a:ext cx="5334000" cy="3638550"/>
+                    </a:xfrm>
+                    <a:prstGeom prst="rect">
+                      <a:avLst/>
+                    </a:prstGeom>
+                  </pic:spPr>
+                </pic:pic>
+              </a:graphicData>
+            </a:graphic>
+          </wp:inline>
+        </w:drawing>
+      </w:r>
+    </w:p>
+    <w:p>
+      <w:pPr>
+        <w:spacing w:after="40" w:before="150"/>
       </w:pPr>
       <w:r>
         <w:rPr>
@@ -307,72 +352,102 @@
           <w:sz w:val="18"/>
           <w:szCs w:val="18"/>
         </w:rPr>
-        <w:t xml:space="preserve">Navigeren</w:t>
-      </w:r>
-    </w:p>
-    <w:p>
-      <w:pPr>
-        <w:pStyle w:val="ListParagraph"/>
-        <w:numPr>
-          <w:ilvl w:val="0"/>
-          <w:numId w:val="2"/>
-        </w:numPr>
-        <w:spacing w:after="20"/>
-      </w:pPr>
-      <w:r>
-        <w:rPr>
-          <w:rFonts w:ascii="Calibri" w:cs="Calibri" w:eastAsia="Calibri" w:hAnsi="Calibri"/>
-          <w:b/>
-          <w:bCs/>
-          <w:color w:val="23201A"/>
-          <w:sz w:val="20"/>
-          <w:szCs w:val="20"/>
-        </w:rPr>
-        <w:t xml:space="preserve">Menu</w:t>
-      </w:r>
-      <w:r>
-        <w:rPr>
-          <w:rFonts w:ascii="Calibri" w:cs="Calibri" w:eastAsia="Calibri" w:hAnsi="Calibri"/>
-          <w:color w:val="23201A"/>
-          <w:sz w:val="20"/>
-          <w:szCs w:val="20"/>
-        </w:rPr>
-        <w:t xml:space="preserve"> — op desktop links, op mobiel via de onderbalk. Getallen naast een item tonen wat nieuw of open is.</w:t>
-      </w:r>
-    </w:p>
-    <w:p>
-      <w:pPr>
-        <w:pStyle w:val="ListParagraph"/>
-        <w:numPr>
-          <w:ilvl w:val="0"/>
-          <w:numId w:val="2"/>
-        </w:numPr>
-        <w:spacing w:after="20"/>
-      </w:pPr>
-      <w:r>
-        <w:rPr>
-          <w:rFonts w:ascii="Calibri" w:cs="Calibri" w:eastAsia="Calibri" w:hAnsi="Calibri"/>
-          <w:b/>
-          <w:bCs/>
-          <w:color w:val="23201A"/>
-          <w:sz w:val="20"/>
-          <w:szCs w:val="20"/>
-        </w:rPr>
-        <w:t xml:space="preserve">Overzicht</w:t>
-      </w:r>
-      <w:r>
-        <w:rPr>
-          <w:rFonts w:ascii="Calibri" w:cs="Calibri" w:eastAsia="Calibri" w:hAnsi="Calibri"/>
-          <w:color w:val="23201A"/>
-          <w:sz w:val="20"/>
-          <w:szCs w:val="20"/>
-        </w:rPr>
-        <w:t xml:space="preserve"> — je startpagina met je belangrijkste zaken in één blik.</w:t>
-      </w:r>
-    </w:p>
-    <w:p>
-      <w:pPr>
-        <w:spacing w:after="40" w:before="140"/>
+        <w:t xml:space="preserve">Taal, thema &amp; de app installeren</w:t>
+      </w:r>
+    </w:p>
+    <w:p>
+      <w:pPr>
+        <w:pStyle w:val="ListParagraph"/>
+        <w:numPr>
+          <w:ilvl w:val="0"/>
+          <w:numId w:val="2"/>
+        </w:numPr>
+        <w:spacing w:after="20"/>
+      </w:pPr>
+      <w:r>
+        <w:rPr>
+          <w:rFonts w:ascii="Calibri" w:cs="Calibri" w:eastAsia="Calibri" w:hAnsi="Calibri"/>
+          <w:b/>
+          <w:bCs/>
+          <w:color w:val="23201A"/>
+          <w:sz w:val="20"/>
+          <w:szCs w:val="20"/>
+        </w:rPr>
+        <w:t xml:space="preserve">Taal</w:t>
+      </w:r>
+      <w:r>
+        <w:rPr>
+          <w:rFonts w:ascii="Calibri" w:cs="Calibri" w:eastAsia="Calibri" w:hAnsi="Calibri"/>
+          <w:color w:val="23201A"/>
+          <w:sz w:val="20"/>
+          <w:szCs w:val="20"/>
+        </w:rPr>
+        <w:t xml:space="preserve"> — rechtsboven kies je Nederlands, Engels, Spaans, Portugees, Frans of Chinees. De hele app schakelt direct mee.</w:t>
+      </w:r>
+    </w:p>
+    <w:p>
+      <w:pPr>
+        <w:pStyle w:val="ListParagraph"/>
+        <w:numPr>
+          <w:ilvl w:val="0"/>
+          <w:numId w:val="2"/>
+        </w:numPr>
+        <w:spacing w:after="20"/>
+      </w:pPr>
+      <w:r>
+        <w:rPr>
+          <w:rFonts w:ascii="Calibri" w:cs="Calibri" w:eastAsia="Calibri" w:hAnsi="Calibri"/>
+          <w:b/>
+          <w:bCs/>
+          <w:color w:val="23201A"/>
+          <w:sz w:val="20"/>
+          <w:szCs w:val="20"/>
+        </w:rPr>
+        <w:t xml:space="preserve">Thema</w:t>
+      </w:r>
+      <w:r>
+        <w:rPr>
+          <w:rFonts w:ascii="Calibri" w:cs="Calibri" w:eastAsia="Calibri" w:hAnsi="Calibri"/>
+          <w:color w:val="23201A"/>
+          <w:sz w:val="20"/>
+          <w:szCs w:val="20"/>
+        </w:rPr>
+        <w:t xml:space="preserve"> — met één knop wissel je tussen licht, donker en automatisch (volgt je toestel).</w:t>
+      </w:r>
+    </w:p>
+    <w:p>
+      <w:pPr>
+        <w:pStyle w:val="ListParagraph"/>
+        <w:numPr>
+          <w:ilvl w:val="0"/>
+          <w:numId w:val="2"/>
+        </w:numPr>
+        <w:spacing w:after="20"/>
+      </w:pPr>
+      <w:r>
+        <w:rPr>
+          <w:rFonts w:ascii="Calibri" w:cs="Calibri" w:eastAsia="Calibri" w:hAnsi="Calibri"/>
+          <w:b/>
+          <w:bCs/>
+          <w:color w:val="23201A"/>
+          <w:sz w:val="20"/>
+          <w:szCs w:val="20"/>
+        </w:rPr>
+        <w:t xml:space="preserve">Installeren</w:t>
+      </w:r>
+      <w:r>
+        <w:rPr>
+          <w:rFonts w:ascii="Calibri" w:cs="Calibri" w:eastAsia="Calibri" w:hAnsi="Calibri"/>
+          <w:color w:val="23201A"/>
+          <w:sz w:val="20"/>
+          <w:szCs w:val="20"/>
+        </w:rPr>
+        <w:t xml:space="preserve"> — klik op “Installeer de app”. Op de telefoon zet je BugaWuga zo op je beginscherm; hij opent daarna schermvullend, net als een gedownloade app.</w:t>
+      </w:r>
+    </w:p>
+    <w:p>
+      <w:pPr>
+        <w:spacing w:after="40" w:before="150"/>
       </w:pPr>
       <w:r>
         <w:rPr>
@@ -383,7 +458,7 @@
           <w:sz w:val="18"/>
           <w:szCs w:val="18"/>
         </w:rPr>
-        <w:t xml:space="preserve">Chatten &amp; afspraken</w:t>
+        <w:t xml:space="preserve">Chatten &amp; afspraken maken</w:t>
       </w:r>
     </w:p>
     <w:p>
@@ -413,7 +488,7 @@
           <w:sz w:val="20"/>
           <w:szCs w:val="20"/>
         </w:rPr>
-        <w:t xml:space="preserve"> — overal bereikbaar waar je met een andere partij te maken hebt.</w:t>
+        <w:t xml:space="preserve"> — overal waar je met een andere partij te maken hebt kun je chatten (vanuit de marktplaats, een profiel of een zending).</w:t>
       </w:r>
     </w:p>
     <w:p>
@@ -443,42 +518,87 @@
           <w:sz w:val="20"/>
           <w:szCs w:val="20"/>
         </w:rPr>
-        <w:t xml:space="preserve"> — snelkeuze-knoppen helpen je snel het juiste te vragen.</w:t>
-      </w:r>
-    </w:p>
-    <w:p>
-      <w:pPr>
-        <w:pStyle w:val="ListParagraph"/>
-        <w:numPr>
-          <w:ilvl w:val="0"/>
-          <w:numId w:val="2"/>
-        </w:numPr>
-        <w:spacing w:after="20"/>
-      </w:pPr>
-      <w:r>
-        <w:rPr>
-          <w:rFonts w:ascii="Calibri" w:cs="Calibri" w:eastAsia="Calibri" w:hAnsi="Calibri"/>
-          <w:b/>
-          <w:bCs/>
-          <w:color w:val="23201A"/>
-          <w:sz w:val="20"/>
-          <w:szCs w:val="20"/>
-        </w:rPr>
-        <w:t xml:space="preserve">Afspraak</w:t>
-      </w:r>
-      <w:r>
-        <w:rPr>
-          <w:rFonts w:ascii="Calibri" w:cs="Calibri" w:eastAsia="Calibri" w:hAnsi="Calibri"/>
-          <w:color w:val="23201A"/>
-          <w:sz w:val="20"/>
-          <w:szCs w:val="20"/>
-        </w:rPr>
-        <w:t xml:space="preserve"> — blijft bovenaan het gesprek staan als houvast voor beide partijen.</w:t>
-      </w:r>
-    </w:p>
-    <w:p>
-      <w:pPr>
-        <w:spacing w:after="40" w:before="140"/>
+        <w:t xml:space="preserve"> — onderin de chat staan snelkeuze-knoppen met veelgestelde vragen, zodat je snel het juiste vraagt.</w:t>
+      </w:r>
+    </w:p>
+    <w:p>
+      <w:pPr>
+        <w:pStyle w:val="ListParagraph"/>
+        <w:numPr>
+          <w:ilvl w:val="0"/>
+          <w:numId w:val="2"/>
+        </w:numPr>
+        <w:spacing w:after="20"/>
+      </w:pPr>
+      <w:r>
+        <w:rPr>
+          <w:rFonts w:ascii="Calibri" w:cs="Calibri" w:eastAsia="Calibri" w:hAnsi="Calibri"/>
+          <w:b/>
+          <w:bCs/>
+          <w:color w:val="23201A"/>
+          <w:sz w:val="20"/>
+          <w:szCs w:val="20"/>
+        </w:rPr>
+        <w:t xml:space="preserve">Afspraak vastpinnen</w:t>
+      </w:r>
+      <w:r>
+        <w:rPr>
+          <w:rFonts w:ascii="Calibri" w:cs="Calibri" w:eastAsia="Calibri" w:hAnsi="Calibri"/>
+          <w:color w:val="23201A"/>
+          <w:sz w:val="20"/>
+          <w:szCs w:val="20"/>
+        </w:rPr>
+        <w:t xml:space="preserve"> — leg je afspraak (wat, wanneer, prijs) vast; die blijft bovenaan het gesprek staan als houvast voor beide partijen.</w:t>
+      </w:r>
+    </w:p>
+    <w:p>
+      <w:pPr>
+        <w:spacing w:after="140" w:before="60"/>
+      </w:pPr>
+      <w:r>
+        <w:drawing>
+          <wp:inline distT="0" distB="0" distL="0" distR="0">
+            <wp:extent cx="5334000" cy="3638550"/>
+            <wp:effectExtent t="0" r="0" b="0" l="0"/>
+            <wp:docPr id="1" name="" descr="" title=""/>
+            <wp:cNvGraphicFramePr>
+              <a:graphicFrameLocks xmlns:a="http://schemas.openxmlformats.org/drawingml/2006/main" noChangeAspect="1"/>
+            </wp:cNvGraphicFramePr>
+            <a:graphic xmlns:a="http://schemas.openxmlformats.org/drawingml/2006/main">
+              <a:graphicData uri="http://schemas.openxmlformats.org/drawingml/2006/picture">
+                <pic:pic xmlns:pic="http://schemas.openxmlformats.org/drawingml/2006/picture">
+                  <pic:nvPicPr>
+                    <pic:cNvPr id="0" name="" descr=""/>
+                    <pic:cNvPicPr>
+                      <a:picLocks noChangeAspect="1" noChangeArrowheads="1"/>
+                    </pic:cNvPicPr>
+                  </pic:nvPicPr>
+                  <pic:blipFill>
+                    <a:blip r:embed="rId8" cstate="none"/>
+                    <a:srcRect/>
+                    <a:stretch>
+                      <a:fillRect/>
+                    </a:stretch>
+                  </pic:blipFill>
+                  <pic:spPr bwMode="auto">
+                    <a:xfrm>
+                      <a:off x="0" y="0"/>
+                      <a:ext cx="5334000" cy="3638550"/>
+                    </a:xfrm>
+                    <a:prstGeom prst="rect">
+                      <a:avLst/>
+                    </a:prstGeom>
+                  </pic:spPr>
+                </pic:pic>
+              </a:graphicData>
+            </a:graphic>
+          </wp:inline>
+        </w:drawing>
+      </w:r>
+    </w:p>
+    <w:p>
+      <w:pPr>
+        <w:spacing w:after="40" w:before="150"/>
       </w:pPr>
       <w:r>
         <w:rPr>
@@ -519,37 +639,37 @@
           <w:sz w:val="20"/>
           <w:szCs w:val="20"/>
         </w:rPr>
-        <w:t xml:space="preserve"> — het belletje toont ongelezen updates.</w:t>
-      </w:r>
-    </w:p>
-    <w:p>
-      <w:pPr>
-        <w:pStyle w:val="ListParagraph"/>
-        <w:numPr>
-          <w:ilvl w:val="0"/>
-          <w:numId w:val="2"/>
-        </w:numPr>
-        <w:spacing w:after="20"/>
-      </w:pPr>
-      <w:r>
-        <w:rPr>
-          <w:rFonts w:ascii="Calibri" w:cs="Calibri" w:eastAsia="Calibri" w:hAnsi="Calibri"/>
-          <w:b/>
-          <w:bCs/>
-          <w:color w:val="23201A"/>
-          <w:sz w:val="20"/>
-          <w:szCs w:val="20"/>
-        </w:rPr>
-        <w:t xml:space="preserve">Profiel &amp; verificatie</w:t>
-      </w:r>
-      <w:r>
-        <w:rPr>
-          <w:rFonts w:ascii="Calibri" w:cs="Calibri" w:eastAsia="Calibri" w:hAnsi="Calibri"/>
-          <w:color w:val="23201A"/>
-          <w:sz w:val="20"/>
-          <w:szCs w:val="20"/>
-        </w:rPr>
-        <w:t xml:space="preserve"> — beheer je gegevens op Mijn account; een ✓ betekent geverifieerd.</w:t>
+        <w:t xml:space="preserve"> — het belletje toont ongelezen updates (nieuw bod, bericht, statuswijziging).</w:t>
+      </w:r>
+    </w:p>
+    <w:p>
+      <w:pPr>
+        <w:pStyle w:val="ListParagraph"/>
+        <w:numPr>
+          <w:ilvl w:val="0"/>
+          <w:numId w:val="2"/>
+        </w:numPr>
+        <w:spacing w:after="20"/>
+      </w:pPr>
+      <w:r>
+        <w:rPr>
+          <w:rFonts w:ascii="Calibri" w:cs="Calibri" w:eastAsia="Calibri" w:hAnsi="Calibri"/>
+          <w:b/>
+          <w:bCs/>
+          <w:color w:val="23201A"/>
+          <w:sz w:val="20"/>
+          <w:szCs w:val="20"/>
+        </w:rPr>
+        <w:t xml:space="preserve">Mijn account</w:t>
+      </w:r>
+      <w:r>
+        <w:rPr>
+          <w:rFonts w:ascii="Calibri" w:cs="Calibri" w:eastAsia="Calibri" w:hAnsi="Calibri"/>
+          <w:color w:val="23201A"/>
+          <w:sz w:val="20"/>
+          <w:szCs w:val="20"/>
+        </w:rPr>
+        <w:t xml:space="preserve"> — beheer je naam, telefoon en wachtwoord. Verificatie (KYC) staat hier ook; een ✓ betekent dat je kunt betalen, boeken en uitbetaald worden.</w:t>
       </w:r>
     </w:p>
     <w:p>
@@ -579,7 +699,7 @@
           <w:sz w:val="20"/>
           <w:szCs w:val="20"/>
         </w:rPr>
-        <w:t xml:space="preserve"> — met de 💬-knop stuur je opmerkingen rechtstreeks naar het team.</w:t>
+        <w:t xml:space="preserve"> — met de 💬-knop rechtsonder stuur je op elke pagina een opmerking; die komt gebundeld bij het team binnen, inclusief de pagina waar je was.</w:t>
       </w:r>
     </w:p>
     <w:p>
@@ -613,7 +733,7 @@
           <w:sz w:val="28"/>
           <w:szCs w:val="28"/>
         </w:rPr>
-        <w:t xml:space="preserve">📦  Iets versturen</w:t>
+        <w:t xml:space="preserve">📦  Afzender — iets versturen</w:t>
       </w:r>
     </w:p>
     <w:p>
@@ -629,12 +749,12 @@
           <w:sz w:val="20"/>
           <w:szCs w:val="20"/>
         </w:rPr>
-        <w:t xml:space="preserve">Van pakket aanmelden tot betaling en levering.</w:t>
-      </w:r>
-    </w:p>
-    <w:p>
-      <w:pPr>
-        <w:spacing w:after="40" w:before="140"/>
+        <w:t xml:space="preserve">Van pakket aanmelden tot betaling, volgen en levering met code.</w:t>
+      </w:r>
+    </w:p>
+    <w:p>
+      <w:pPr>
+        <w:spacing w:after="40" w:before="150"/>
       </w:pPr>
       <w:r>
         <w:rPr>
@@ -645,37 +765,67 @@
           <w:sz w:val="18"/>
           <w:szCs w:val="18"/>
         </w:rPr>
-        <w:t xml:space="preserve">1. Aanmelden &amp; check</w:t>
-      </w:r>
-    </w:p>
-    <w:p>
-      <w:pPr>
-        <w:pStyle w:val="ListParagraph"/>
-        <w:numPr>
-          <w:ilvl w:val="0"/>
-          <w:numId w:val="2"/>
-        </w:numPr>
-        <w:spacing w:after="20"/>
-      </w:pPr>
-      <w:r>
-        <w:rPr>
-          <w:rFonts w:ascii="Calibri" w:cs="Calibri" w:eastAsia="Calibri" w:hAnsi="Calibri"/>
-          <w:b/>
-          <w:bCs/>
-          <w:color w:val="23201A"/>
-          <w:sz w:val="20"/>
-          <w:szCs w:val="20"/>
-        </w:rPr>
-        <w:t xml:space="preserve">Verzenden</w:t>
-      </w:r>
-      <w:r>
-        <w:rPr>
-          <w:rFonts w:ascii="Calibri" w:cs="Calibri" w:eastAsia="Calibri" w:hAnsi="Calibri"/>
-          <w:color w:val="23201A"/>
-          <w:sz w:val="20"/>
-          <w:szCs w:val="20"/>
-        </w:rPr>
-        <w:t xml:space="preserve"> — geef corridor, ontvanger, gewicht en de inhoud per item op.</w:t>
+        <w:t xml:space="preserve">1. Pakket aanmelden &amp; de gratis check</w:t>
+      </w:r>
+    </w:p>
+    <w:p>
+      <w:pPr>
+        <w:pStyle w:val="ListParagraph"/>
+        <w:numPr>
+          <w:ilvl w:val="0"/>
+          <w:numId w:val="2"/>
+        </w:numPr>
+        <w:spacing w:after="20"/>
+      </w:pPr>
+      <w:r>
+        <w:rPr>
+          <w:rFonts w:ascii="Calibri" w:cs="Calibri" w:eastAsia="Calibri" w:hAnsi="Calibri"/>
+          <w:b/>
+          <w:bCs/>
+          <w:color w:val="23201A"/>
+          <w:sz w:val="20"/>
+          <w:szCs w:val="20"/>
+        </w:rPr>
+        <w:t xml:space="preserve">Start</w:t>
+      </w:r>
+      <w:r>
+        <w:rPr>
+          <w:rFonts w:ascii="Calibri" w:cs="Calibri" w:eastAsia="Calibri" w:hAnsi="Calibri"/>
+          <w:color w:val="23201A"/>
+          <w:sz w:val="20"/>
+          <w:szCs w:val="20"/>
+        </w:rPr>
+        <w:t xml:space="preserve"> — klik op “Pakket versturen” (of open Verzenden). Kies de corridor (nu Nederland → Suriname) en vul de ontvanger in.</w:t>
+      </w:r>
+    </w:p>
+    <w:p>
+      <w:pPr>
+        <w:pStyle w:val="ListParagraph"/>
+        <w:numPr>
+          <w:ilvl w:val="0"/>
+          <w:numId w:val="2"/>
+        </w:numPr>
+        <w:spacing w:after="20"/>
+      </w:pPr>
+      <w:r>
+        <w:rPr>
+          <w:rFonts w:ascii="Calibri" w:cs="Calibri" w:eastAsia="Calibri" w:hAnsi="Calibri"/>
+          <w:b/>
+          <w:bCs/>
+          <w:color w:val="23201A"/>
+          <w:sz w:val="20"/>
+          <w:szCs w:val="20"/>
+        </w:rPr>
+        <w:t xml:space="preserve">Inhoud per item</w:t>
+      </w:r>
+      <w:r>
+        <w:rPr>
+          <w:rFonts w:ascii="Calibri" w:cs="Calibri" w:eastAsia="Calibri" w:hAnsi="Calibri"/>
+          <w:color w:val="23201A"/>
+          <w:sz w:val="20"/>
+          <w:szCs w:val="20"/>
+        </w:rPr>
+        <w:t xml:space="preserve"> — geef elk item op met een korte omschrijving, de waarde en de categorie. Voeg met “+ Item” meer regels toe.</w:t>
       </w:r>
     </w:p>
     <w:p>
@@ -705,12 +855,87 @@
           <w:sz w:val="20"/>
           <w:szCs w:val="20"/>
         </w:rPr>
-        <w:t xml:space="preserve"> — je ziet meteen of het via een reiziger mag en een prijsindicatie.</w:t>
-      </w:r>
-    </w:p>
-    <w:p>
-      <w:pPr>
-        <w:spacing w:after="40" w:before="140"/>
+        <w:t xml:space="preserve"> — je ziet meteen of het pakket via een reiziger mág (Toegestaan / Beoordelen / Geweigerd) én een prijsindicatie. Dit is een automatische regelcheck, geen mens.</w:t>
+      </w:r>
+    </w:p>
+    <w:p>
+      <w:pPr>
+        <w:pStyle w:val="ListParagraph"/>
+        <w:numPr>
+          <w:ilvl w:val="0"/>
+          <w:numId w:val="2"/>
+        </w:numPr>
+        <w:spacing w:after="20"/>
+      </w:pPr>
+      <w:r>
+        <w:rPr>
+          <w:rFonts w:ascii="Calibri" w:cs="Calibri" w:eastAsia="Calibri" w:hAnsi="Calibri"/>
+          <w:b/>
+          <w:bCs/>
+          <w:color w:val="23201A"/>
+          <w:sz w:val="20"/>
+          <w:szCs w:val="20"/>
+        </w:rPr>
+        <w:t xml:space="preserve">Aangeven, niet dichtplakken</w:t>
+      </w:r>
+      <w:r>
+        <w:rPr>
+          <w:rFonts w:ascii="Calibri" w:cs="Calibri" w:eastAsia="Calibri" w:hAnsi="Calibri"/>
+          <w:color w:val="23201A"/>
+          <w:sz w:val="20"/>
+          <w:szCs w:val="20"/>
+        </w:rPr>
+        <w:t xml:space="preserve"> — geef eerlijk op wat erin zit en laat het pakket open/inspecteerbaar. Dat is de kern van veilig versturen.</w:t>
+      </w:r>
+    </w:p>
+    <w:p>
+      <w:pPr>
+        <w:spacing w:after="140" w:before="60"/>
+      </w:pPr>
+      <w:r>
+        <w:drawing>
+          <wp:inline distT="0" distB="0" distL="0" distR="0">
+            <wp:extent cx="5334000" cy="3638550"/>
+            <wp:effectExtent t="0" r="0" b="0" l="0"/>
+            <wp:docPr id="1" name="" descr="" title=""/>
+            <wp:cNvGraphicFramePr>
+              <a:graphicFrameLocks xmlns:a="http://schemas.openxmlformats.org/drawingml/2006/main" noChangeAspect="1"/>
+            </wp:cNvGraphicFramePr>
+            <a:graphic xmlns:a="http://schemas.openxmlformats.org/drawingml/2006/main">
+              <a:graphicData uri="http://schemas.openxmlformats.org/drawingml/2006/picture">
+                <pic:pic xmlns:pic="http://schemas.openxmlformats.org/drawingml/2006/picture">
+                  <pic:nvPicPr>
+                    <pic:cNvPr id="0" name="" descr=""/>
+                    <pic:cNvPicPr>
+                      <a:picLocks noChangeAspect="1" noChangeArrowheads="1"/>
+                    </pic:cNvPicPr>
+                  </pic:nvPicPr>
+                  <pic:blipFill>
+                    <a:blip r:embed="rId9" cstate="none"/>
+                    <a:srcRect/>
+                    <a:stretch>
+                      <a:fillRect/>
+                    </a:stretch>
+                  </pic:blipFill>
+                  <pic:spPr bwMode="auto">
+                    <a:xfrm>
+                      <a:off x="0" y="0"/>
+                      <a:ext cx="5334000" cy="3638550"/>
+                    </a:xfrm>
+                    <a:prstGeom prst="rect">
+                      <a:avLst/>
+                    </a:prstGeom>
+                  </pic:spPr>
+                </pic:pic>
+              </a:graphicData>
+            </a:graphic>
+          </wp:inline>
+        </w:drawing>
+      </w:r>
+    </w:p>
+    <w:p>
+      <w:pPr>
+        <w:spacing w:after="40" w:before="150"/>
       </w:pPr>
       <w:r>
         <w:rPr>
@@ -721,37 +946,67 @@
           <w:sz w:val="18"/>
           <w:szCs w:val="18"/>
         </w:rPr>
-        <w:t xml:space="preserve">2. Zichtbaar maken</w:t>
-      </w:r>
-    </w:p>
-    <w:p>
-      <w:pPr>
-        <w:pStyle w:val="ListParagraph"/>
-        <w:numPr>
-          <w:ilvl w:val="0"/>
-          <w:numId w:val="2"/>
-        </w:numPr>
-        <w:spacing w:after="20"/>
-      </w:pPr>
-      <w:r>
-        <w:rPr>
-          <w:rFonts w:ascii="Calibri" w:cs="Calibri" w:eastAsia="Calibri" w:hAnsi="Calibri"/>
-          <w:b/>
-          <w:bCs/>
-          <w:color w:val="23201A"/>
-          <w:sz w:val="20"/>
-          <w:szCs w:val="20"/>
-        </w:rPr>
-        <w:t xml:space="preserve">Op de marktplaats</w:t>
-      </w:r>
-      <w:r>
-        <w:rPr>
-          <w:rFonts w:ascii="Calibri" w:cs="Calibri" w:eastAsia="Calibri" w:hAnsi="Calibri"/>
-          <w:color w:val="23201A"/>
-          <w:sz w:val="20"/>
-          <w:szCs w:val="20"/>
-        </w:rPr>
-        <w:t xml:space="preserve"> — zet je verzoek zichtbaar zodat reizigers het zien.</w:t>
+        <w:t xml:space="preserve">2. Zichtbaar maken op de marktplaats</w:t>
+      </w:r>
+    </w:p>
+    <w:p>
+      <w:pPr>
+        <w:pStyle w:val="ListParagraph"/>
+        <w:numPr>
+          <w:ilvl w:val="0"/>
+          <w:numId w:val="2"/>
+        </w:numPr>
+        <w:spacing w:after="20"/>
+      </w:pPr>
+      <w:r>
+        <w:rPr>
+          <w:rFonts w:ascii="Calibri" w:cs="Calibri" w:eastAsia="Calibri" w:hAnsi="Calibri"/>
+          <w:b/>
+          <w:bCs/>
+          <w:color w:val="23201A"/>
+          <w:sz w:val="20"/>
+          <w:szCs w:val="20"/>
+        </w:rPr>
+        <w:t xml:space="preserve">Zichtbaar zetten</w:t>
+      </w:r>
+      <w:r>
+        <w:rPr>
+          <w:rFonts w:ascii="Calibri" w:cs="Calibri" w:eastAsia="Calibri" w:hAnsi="Calibri"/>
+          <w:color w:val="23201A"/>
+          <w:sz w:val="20"/>
+          <w:szCs w:val="20"/>
+        </w:rPr>
+        <w:t xml:space="preserve"> — open je zending en zet ‘m zichtbaar op de marktplaats, zodat reizigers je verzoek zien.</w:t>
+      </w:r>
+    </w:p>
+    <w:p>
+      <w:pPr>
+        <w:pStyle w:val="ListParagraph"/>
+        <w:numPr>
+          <w:ilvl w:val="0"/>
+          <w:numId w:val="2"/>
+        </w:numPr>
+        <w:spacing w:after="20"/>
+      </w:pPr>
+      <w:r>
+        <w:rPr>
+          <w:rFonts w:ascii="Calibri" w:cs="Calibri" w:eastAsia="Calibri" w:hAnsi="Calibri"/>
+          <w:b/>
+          <w:bCs/>
+          <w:color w:val="23201A"/>
+          <w:sz w:val="20"/>
+          <w:szCs w:val="20"/>
+        </w:rPr>
+        <w:t xml:space="preserve">Prijs &amp; info</w:t>
+      </w:r>
+      <w:r>
+        <w:rPr>
+          <w:rFonts w:ascii="Calibri" w:cs="Calibri" w:eastAsia="Calibri" w:hAnsi="Calibri"/>
+          <w:color w:val="23201A"/>
+          <w:sz w:val="20"/>
+          <w:szCs w:val="20"/>
+        </w:rPr>
+        <w:t xml:space="preserve"> — geef aan wat je wilt betalen en een korte toelichting.</w:t>
       </w:r>
     </w:p>
     <w:p>
@@ -781,12 +1036,57 @@
           <w:sz w:val="20"/>
           <w:szCs w:val="20"/>
         </w:rPr>
-        <w:t xml:space="preserve"> — toon het óók anoniem op de publieke website (alleen voornaam + initiaal).</w:t>
-      </w:r>
-    </w:p>
-    <w:p>
-      <w:pPr>
-        <w:spacing w:after="40" w:before="140"/>
+        <w:t xml:space="preserve"> — je kunt je verzoek óók anoniem op de publieke website tonen (alleen voornaam + initiaal, bestemming, gewicht en prijs — nooit de inhoud, je adres of contactgegevens).</w:t>
+      </w:r>
+    </w:p>
+    <w:p>
+      <w:pPr>
+        <w:spacing w:after="140" w:before="60"/>
+      </w:pPr>
+      <w:r>
+        <w:drawing>
+          <wp:inline distT="0" distB="0" distL="0" distR="0">
+            <wp:extent cx="5334000" cy="3638550"/>
+            <wp:effectExtent t="0" r="0" b="0" l="0"/>
+            <wp:docPr id="1" name="" descr="" title=""/>
+            <wp:cNvGraphicFramePr>
+              <a:graphicFrameLocks xmlns:a="http://schemas.openxmlformats.org/drawingml/2006/main" noChangeAspect="1"/>
+            </wp:cNvGraphicFramePr>
+            <a:graphic xmlns:a="http://schemas.openxmlformats.org/drawingml/2006/main">
+              <a:graphicData uri="http://schemas.openxmlformats.org/drawingml/2006/picture">
+                <pic:pic xmlns:pic="http://schemas.openxmlformats.org/drawingml/2006/picture">
+                  <pic:nvPicPr>
+                    <pic:cNvPr id="0" name="" descr=""/>
+                    <pic:cNvPicPr>
+                      <a:picLocks noChangeAspect="1" noChangeArrowheads="1"/>
+                    </pic:cNvPicPr>
+                  </pic:nvPicPr>
+                  <pic:blipFill>
+                    <a:blip r:embed="rId10" cstate="none"/>
+                    <a:srcRect/>
+                    <a:stretch>
+                      <a:fillRect/>
+                    </a:stretch>
+                  </pic:blipFill>
+                  <pic:spPr bwMode="auto">
+                    <a:xfrm>
+                      <a:off x="0" y="0"/>
+                      <a:ext cx="5334000" cy="3638550"/>
+                    </a:xfrm>
+                    <a:prstGeom prst="rect">
+                      <a:avLst/>
+                    </a:prstGeom>
+                  </pic:spPr>
+                </pic:pic>
+              </a:graphicData>
+            </a:graphic>
+          </wp:inline>
+        </w:drawing>
+      </w:r>
+    </w:p>
+    <w:p>
+      <w:pPr>
+        <w:spacing w:after="40" w:before="150"/>
       </w:pPr>
       <w:r>
         <w:rPr>
@@ -797,72 +1097,102 @@
           <w:sz w:val="18"/>
           <w:szCs w:val="18"/>
         </w:rPr>
-        <w:t xml:space="preserve">3. Bod, afspraak &amp; betaling</w:t>
-      </w:r>
-    </w:p>
-    <w:p>
-      <w:pPr>
-        <w:pStyle w:val="ListParagraph"/>
-        <w:numPr>
-          <w:ilvl w:val="0"/>
-          <w:numId w:val="2"/>
-        </w:numPr>
-        <w:spacing w:after="20"/>
-      </w:pPr>
-      <w:r>
-        <w:rPr>
-          <w:rFonts w:ascii="Calibri" w:cs="Calibri" w:eastAsia="Calibri" w:hAnsi="Calibri"/>
-          <w:b/>
-          <w:bCs/>
-          <w:color w:val="23201A"/>
-          <w:sz w:val="20"/>
-          <w:szCs w:val="20"/>
-        </w:rPr>
-        <w:t xml:space="preserve">Bod ontvangen</w:t>
-      </w:r>
-      <w:r>
-        <w:rPr>
-          <w:rFonts w:ascii="Calibri" w:cs="Calibri" w:eastAsia="Calibri" w:hAnsi="Calibri"/>
-          <w:color w:val="23201A"/>
-          <w:sz w:val="20"/>
-          <w:szCs w:val="20"/>
-        </w:rPr>
-        <w:t xml:space="preserve"> — reageert een reiziger, dan opent automatisch een chat.</w:t>
-      </w:r>
-    </w:p>
-    <w:p>
-      <w:pPr>
-        <w:pStyle w:val="ListParagraph"/>
-        <w:numPr>
-          <w:ilvl w:val="0"/>
-          <w:numId w:val="2"/>
-        </w:numPr>
-        <w:spacing w:after="20"/>
-      </w:pPr>
-      <w:r>
-        <w:rPr>
-          <w:rFonts w:ascii="Calibri" w:cs="Calibri" w:eastAsia="Calibri" w:hAnsi="Calibri"/>
-          <w:b/>
-          <w:bCs/>
-          <w:color w:val="23201A"/>
-          <w:sz w:val="20"/>
-          <w:szCs w:val="20"/>
-        </w:rPr>
-        <w:t xml:space="preserve">Accepteren &amp; betalen</w:t>
-      </w:r>
-      <w:r>
-        <w:rPr>
-          <w:rFonts w:ascii="Calibri" w:cs="Calibri" w:eastAsia="Calibri" w:hAnsi="Calibri"/>
-          <w:color w:val="23201A"/>
-          <w:sz w:val="20"/>
-          <w:szCs w:val="20"/>
-        </w:rPr>
-        <w:t xml:space="preserve"> — het bedrag wordt vastgehouden tot bewijs van levering.</w:t>
-      </w:r>
-    </w:p>
-    <w:p>
-      <w:pPr>
-        <w:spacing w:after="40" w:before="140"/>
+        <w:t xml:space="preserve">3. Bod ontvangen, chatten &amp; betalen</w:t>
+      </w:r>
+    </w:p>
+    <w:p>
+      <w:pPr>
+        <w:pStyle w:val="ListParagraph"/>
+        <w:numPr>
+          <w:ilvl w:val="0"/>
+          <w:numId w:val="2"/>
+        </w:numPr>
+        <w:spacing w:after="20"/>
+      </w:pPr>
+      <w:r>
+        <w:rPr>
+          <w:rFonts w:ascii="Calibri" w:cs="Calibri" w:eastAsia="Calibri" w:hAnsi="Calibri"/>
+          <w:b/>
+          <w:bCs/>
+          <w:color w:val="23201A"/>
+          <w:sz w:val="20"/>
+          <w:szCs w:val="20"/>
+        </w:rPr>
+        <w:t xml:space="preserve">Bod</w:t>
+      </w:r>
+      <w:r>
+        <w:rPr>
+          <w:rFonts w:ascii="Calibri" w:cs="Calibri" w:eastAsia="Calibri" w:hAnsi="Calibri"/>
+          <w:color w:val="23201A"/>
+          <w:sz w:val="20"/>
+          <w:szCs w:val="20"/>
+        </w:rPr>
+        <w:t xml:space="preserve"> — reageert een reiziger, dan opent automatisch een chat met het bod erin.</w:t>
+      </w:r>
+    </w:p>
+    <w:p>
+      <w:pPr>
+        <w:pStyle w:val="ListParagraph"/>
+        <w:numPr>
+          <w:ilvl w:val="0"/>
+          <w:numId w:val="2"/>
+        </w:numPr>
+        <w:spacing w:after="20"/>
+      </w:pPr>
+      <w:r>
+        <w:rPr>
+          <w:rFonts w:ascii="Calibri" w:cs="Calibri" w:eastAsia="Calibri" w:hAnsi="Calibri"/>
+          <w:b/>
+          <w:bCs/>
+          <w:color w:val="23201A"/>
+          <w:sz w:val="20"/>
+          <w:szCs w:val="20"/>
+        </w:rPr>
+        <w:t xml:space="preserve">Overleggen</w:t>
+      </w:r>
+      <w:r>
+        <w:rPr>
+          <w:rFonts w:ascii="Calibri" w:cs="Calibri" w:eastAsia="Calibri" w:hAnsi="Calibri"/>
+          <w:color w:val="23201A"/>
+          <w:sz w:val="20"/>
+          <w:szCs w:val="20"/>
+        </w:rPr>
+        <w:t xml:space="preserve"> — stem via de chat de details en de prijs af en leg de afspraak vast.</w:t>
+      </w:r>
+    </w:p>
+    <w:p>
+      <w:pPr>
+        <w:pStyle w:val="ListParagraph"/>
+        <w:numPr>
+          <w:ilvl w:val="0"/>
+          <w:numId w:val="2"/>
+        </w:numPr>
+        <w:spacing w:after="20"/>
+      </w:pPr>
+      <w:r>
+        <w:rPr>
+          <w:rFonts w:ascii="Calibri" w:cs="Calibri" w:eastAsia="Calibri" w:hAnsi="Calibri"/>
+          <w:b/>
+          <w:bCs/>
+          <w:color w:val="23201A"/>
+          <w:sz w:val="20"/>
+          <w:szCs w:val="20"/>
+        </w:rPr>
+        <w:t xml:space="preserve">Betalen</w:t>
+      </w:r>
+      <w:r>
+        <w:rPr>
+          <w:rFonts w:ascii="Calibri" w:cs="Calibri" w:eastAsia="Calibri" w:hAnsi="Calibri"/>
+          <w:color w:val="23201A"/>
+          <w:sz w:val="20"/>
+          <w:szCs w:val="20"/>
+        </w:rPr>
+        <w:t xml:space="preserve"> — accepteer het bod en reken af. Je betaling wordt veilig vastgehouden en pas vrijgegeven na bewijs van levering.</w:t>
+      </w:r>
+    </w:p>
+    <w:p>
+      <w:pPr>
+        <w:spacing w:after="40" w:before="150"/>
       </w:pPr>
       <w:r>
         <w:rPr>
@@ -873,37 +1203,67 @@
           <w:sz w:val="18"/>
           <w:szCs w:val="18"/>
         </w:rPr>
-        <w:t xml:space="preserve">4. Volgen &amp; leveren</w:t>
-      </w:r>
-    </w:p>
-    <w:p>
-      <w:pPr>
-        <w:pStyle w:val="ListParagraph"/>
-        <w:numPr>
-          <w:ilvl w:val="0"/>
-          <w:numId w:val="2"/>
-        </w:numPr>
-        <w:spacing w:after="20"/>
-      </w:pPr>
-      <w:r>
-        <w:rPr>
-          <w:rFonts w:ascii="Calibri" w:cs="Calibri" w:eastAsia="Calibri" w:hAnsi="Calibri"/>
-          <w:b/>
-          <w:bCs/>
-          <w:color w:val="23201A"/>
-          <w:sz w:val="20"/>
-          <w:szCs w:val="20"/>
-        </w:rPr>
-        <w:t xml:space="preserve">Statustijdlijn &amp; label</w:t>
-      </w:r>
-      <w:r>
-        <w:rPr>
-          <w:rFonts w:ascii="Calibri" w:cs="Calibri" w:eastAsia="Calibri" w:hAnsi="Calibri"/>
-          <w:color w:val="23201A"/>
-          <w:sz w:val="20"/>
-          <w:szCs w:val="20"/>
-        </w:rPr>
-        <w:t xml:space="preserve"> — volg elke stap en open/print het label.</w:t>
+        <w:t xml:space="preserve">4. Volgen &amp; afleveren met ontvangstcode</w:t>
+      </w:r>
+    </w:p>
+    <w:p>
+      <w:pPr>
+        <w:pStyle w:val="ListParagraph"/>
+        <w:numPr>
+          <w:ilvl w:val="0"/>
+          <w:numId w:val="2"/>
+        </w:numPr>
+        <w:spacing w:after="20"/>
+      </w:pPr>
+      <w:r>
+        <w:rPr>
+          <w:rFonts w:ascii="Calibri" w:cs="Calibri" w:eastAsia="Calibri" w:hAnsi="Calibri"/>
+          <w:b/>
+          <w:bCs/>
+          <w:color w:val="23201A"/>
+          <w:sz w:val="20"/>
+          <w:szCs w:val="20"/>
+        </w:rPr>
+        <w:t xml:space="preserve">Statustijdlijn</w:t>
+      </w:r>
+      <w:r>
+        <w:rPr>
+          <w:rFonts w:ascii="Calibri" w:cs="Calibri" w:eastAsia="Calibri" w:hAnsi="Calibri"/>
+          <w:color w:val="23201A"/>
+          <w:sz w:val="20"/>
+          <w:szCs w:val="20"/>
+        </w:rPr>
+        <w:t xml:space="preserve"> — op de zending volg je elke stap (aangemaakt → verzegeld → onderweg → klaar voor afhalen → afgeleverd).</w:t>
+      </w:r>
+    </w:p>
+    <w:p>
+      <w:pPr>
+        <w:pStyle w:val="ListParagraph"/>
+        <w:numPr>
+          <w:ilvl w:val="0"/>
+          <w:numId w:val="2"/>
+        </w:numPr>
+        <w:spacing w:after="20"/>
+      </w:pPr>
+      <w:r>
+        <w:rPr>
+          <w:rFonts w:ascii="Calibri" w:cs="Calibri" w:eastAsia="Calibri" w:hAnsi="Calibri"/>
+          <w:b/>
+          <w:bCs/>
+          <w:color w:val="23201A"/>
+          <w:sz w:val="20"/>
+          <w:szCs w:val="20"/>
+        </w:rPr>
+        <w:t xml:space="preserve">Label</w:t>
+      </w:r>
+      <w:r>
+        <w:rPr>
+          <w:rFonts w:ascii="Calibri" w:cs="Calibri" w:eastAsia="Calibri" w:hAnsi="Calibri"/>
+          <w:color w:val="23201A"/>
+          <w:sz w:val="20"/>
+          <w:szCs w:val="20"/>
+        </w:rPr>
+        <w:t xml:space="preserve"> — open of print het verzendlabel.</w:t>
       </w:r>
     </w:p>
     <w:p>
@@ -933,12 +1293,57 @@
           <w:sz w:val="20"/>
           <w:szCs w:val="20"/>
         </w:rPr>
-        <w:t xml:space="preserve"> — geef de 6-cijferige code aan de ontvanger; levering wordt pas bevestigd als de code klopt.</w:t>
-      </w:r>
-    </w:p>
-    <w:p>
-      <w:pPr>
-        <w:spacing w:after="40" w:before="140"/>
+        <w:t xml:space="preserve"> — zodra de zending klaar is voor aflevering verschijnt een 6-cijferige ontvangstcode. Geef die aan de ontvanger; de levering wordt pas bevestigd (en de betaling vrijgegeven) als de code klopt.</w:t>
+      </w:r>
+    </w:p>
+    <w:p>
+      <w:pPr>
+        <w:spacing w:after="140" w:before="60"/>
+      </w:pPr>
+      <w:r>
+        <w:drawing>
+          <wp:inline distT="0" distB="0" distL="0" distR="0">
+            <wp:extent cx="5334000" cy="3638550"/>
+            <wp:effectExtent t="0" r="0" b="0" l="0"/>
+            <wp:docPr id="1" name="" descr="" title=""/>
+            <wp:cNvGraphicFramePr>
+              <a:graphicFrameLocks xmlns:a="http://schemas.openxmlformats.org/drawingml/2006/main" noChangeAspect="1"/>
+            </wp:cNvGraphicFramePr>
+            <a:graphic xmlns:a="http://schemas.openxmlformats.org/drawingml/2006/main">
+              <a:graphicData uri="http://schemas.openxmlformats.org/drawingml/2006/picture">
+                <pic:pic xmlns:pic="http://schemas.openxmlformats.org/drawingml/2006/picture">
+                  <pic:nvPicPr>
+                    <pic:cNvPr id="0" name="" descr=""/>
+                    <pic:cNvPicPr>
+                      <a:picLocks noChangeAspect="1" noChangeArrowheads="1"/>
+                    </pic:cNvPicPr>
+                  </pic:nvPicPr>
+                  <pic:blipFill>
+                    <a:blip r:embed="rId11" cstate="none"/>
+                    <a:srcRect/>
+                    <a:stretch>
+                      <a:fillRect/>
+                    </a:stretch>
+                  </pic:blipFill>
+                  <pic:spPr bwMode="auto">
+                    <a:xfrm>
+                      <a:off x="0" y="0"/>
+                      <a:ext cx="5334000" cy="3638550"/>
+                    </a:xfrm>
+                    <a:prstGeom prst="rect">
+                      <a:avLst/>
+                    </a:prstGeom>
+                  </pic:spPr>
+                </pic:pic>
+              </a:graphicData>
+            </a:graphic>
+          </wp:inline>
+        </w:drawing>
+      </w:r>
+    </w:p>
+    <w:p>
+      <w:pPr>
+        <w:spacing w:after="40" w:before="150"/>
       </w:pPr>
       <w:r>
         <w:rPr>
@@ -949,7 +1354,7 @@
           <w:sz w:val="18"/>
           <w:szCs w:val="18"/>
         </w:rPr>
-        <w:t xml:space="preserve">5. Na de levering</w:t>
+        <w:t xml:space="preserve">5. Na de levering &amp; bij problemen</w:t>
       </w:r>
     </w:p>
     <w:p>
@@ -979,67 +1384,143 @@
           <w:sz w:val="20"/>
           <w:szCs w:val="20"/>
         </w:rPr>
-        <w:t xml:space="preserve"> — laat sterren achter voor de reiziger.</w:t>
-      </w:r>
-    </w:p>
-    <w:p>
-      <w:pPr>
-        <w:pStyle w:val="ListParagraph"/>
-        <w:numPr>
-          <w:ilvl w:val="0"/>
-          <w:numId w:val="2"/>
-        </w:numPr>
-        <w:spacing w:after="20"/>
-      </w:pPr>
-      <w:r>
-        <w:rPr>
-          <w:rFonts w:ascii="Calibri" w:cs="Calibri" w:eastAsia="Calibri" w:hAnsi="Calibri"/>
-          <w:b/>
-          <w:bCs/>
-          <w:color w:val="23201A"/>
-          <w:sz w:val="20"/>
-          <w:szCs w:val="20"/>
-        </w:rPr>
-        <w:t xml:space="preserve">Probleem?</w:t>
-      </w:r>
-      <w:r>
-        <w:rPr>
-          <w:rFonts w:ascii="Calibri" w:cs="Calibri" w:eastAsia="Calibri" w:hAnsi="Calibri"/>
-          <w:color w:val="23201A"/>
-          <w:sz w:val="20"/>
-          <w:szCs w:val="20"/>
-        </w:rPr>
-        <w:t xml:space="preserve"> — open een claim/retour of meld een gebruiker.</w:t>
-      </w:r>
-    </w:p>
-    <w:p>
-      <w:pPr>
-        <w:pStyle w:val="ListParagraph"/>
-        <w:numPr>
-          <w:ilvl w:val="0"/>
-          <w:numId w:val="2"/>
-        </w:numPr>
-        <w:spacing w:after="20"/>
-      </w:pPr>
-      <w:r>
-        <w:rPr>
-          <w:rFonts w:ascii="Calibri" w:cs="Calibri" w:eastAsia="Calibri" w:hAnsi="Calibri"/>
-          <w:b/>
-          <w:bCs/>
-          <w:color w:val="23201A"/>
-          <w:sz w:val="20"/>
-          <w:szCs w:val="20"/>
-        </w:rPr>
-        <w:t xml:space="preserve">Handig</w:t>
-      </w:r>
-      <w:r>
-        <w:rPr>
-          <w:rFonts w:ascii="Calibri" w:cs="Calibri" w:eastAsia="Calibri" w:hAnsi="Calibri"/>
-          <w:color w:val="23201A"/>
-          <w:sz w:val="20"/>
-          <w:szCs w:val="20"/>
-        </w:rPr>
-        <w:t xml:space="preserve"> — adres- &amp; productboek en bulk-upload voor meerdere zendingen.</w:t>
+        <w:t xml:space="preserve"> — laat sterren achter voor de reiziger; dat bouwt vertrouwen op in de community.</w:t>
+      </w:r>
+    </w:p>
+    <w:p>
+      <w:pPr>
+        <w:pStyle w:val="ListParagraph"/>
+        <w:numPr>
+          <w:ilvl w:val="0"/>
+          <w:numId w:val="2"/>
+        </w:numPr>
+        <w:spacing w:after="20"/>
+      </w:pPr>
+      <w:r>
+        <w:rPr>
+          <w:rFonts w:ascii="Calibri" w:cs="Calibri" w:eastAsia="Calibri" w:hAnsi="Calibri"/>
+          <w:b/>
+          <w:bCs/>
+          <w:color w:val="23201A"/>
+          <w:sz w:val="20"/>
+          <w:szCs w:val="20"/>
+        </w:rPr>
+        <w:t xml:space="preserve">Claim of retour</w:t>
+      </w:r>
+      <w:r>
+        <w:rPr>
+          <w:rFonts w:ascii="Calibri" w:cs="Calibri" w:eastAsia="Calibri" w:hAnsi="Calibri"/>
+          <w:color w:val="23201A"/>
+          <w:sz w:val="20"/>
+          <w:szCs w:val="20"/>
+        </w:rPr>
+        <w:t xml:space="preserve"> — is er iets mis met de levering, open dan een claim of vraag een retour aan.</w:t>
+      </w:r>
+    </w:p>
+    <w:p>
+      <w:pPr>
+        <w:pStyle w:val="ListParagraph"/>
+        <w:numPr>
+          <w:ilvl w:val="0"/>
+          <w:numId w:val="2"/>
+        </w:numPr>
+        <w:spacing w:after="20"/>
+      </w:pPr>
+      <w:r>
+        <w:rPr>
+          <w:rFonts w:ascii="Calibri" w:cs="Calibri" w:eastAsia="Calibri" w:hAnsi="Calibri"/>
+          <w:b/>
+          <w:bCs/>
+          <w:color w:val="23201A"/>
+          <w:sz w:val="20"/>
+          <w:szCs w:val="20"/>
+        </w:rPr>
+        <w:t xml:space="preserve">Melden</w:t>
+      </w:r>
+      <w:r>
+        <w:rPr>
+          <w:rFonts w:ascii="Calibri" w:cs="Calibri" w:eastAsia="Calibri" w:hAnsi="Calibri"/>
+          <w:color w:val="23201A"/>
+          <w:sz w:val="20"/>
+          <w:szCs w:val="20"/>
+        </w:rPr>
+        <w:t xml:space="preserve"> — gedraagt iemand zich verkeerd? Meld de gebruiker; het komt binnen bij het beheer.</w:t>
+      </w:r>
+    </w:p>
+    <w:p>
+      <w:pPr>
+        <w:spacing w:after="40" w:before="150"/>
+      </w:pPr>
+      <w:r>
+        <w:rPr>
+          <w:rFonts w:ascii="Calibri" w:cs="Calibri" w:eastAsia="Calibri" w:hAnsi="Calibri"/>
+          <w:b/>
+          <w:bCs/>
+          <w:color w:val="4F7A1B"/>
+          <w:sz w:val="18"/>
+          <w:szCs w:val="18"/>
+        </w:rPr>
+        <w:t xml:space="preserve">6. Handige extra's</w:t>
+      </w:r>
+    </w:p>
+    <w:p>
+      <w:pPr>
+        <w:pStyle w:val="ListParagraph"/>
+        <w:numPr>
+          <w:ilvl w:val="0"/>
+          <w:numId w:val="2"/>
+        </w:numPr>
+        <w:spacing w:after="20"/>
+      </w:pPr>
+      <w:r>
+        <w:rPr>
+          <w:rFonts w:ascii="Calibri" w:cs="Calibri" w:eastAsia="Calibri" w:hAnsi="Calibri"/>
+          <w:b/>
+          <w:bCs/>
+          <w:color w:val="23201A"/>
+          <w:sz w:val="20"/>
+          <w:szCs w:val="20"/>
+        </w:rPr>
+        <w:t xml:space="preserve">Adres- &amp; productboek</w:t>
+      </w:r>
+      <w:r>
+        <w:rPr>
+          <w:rFonts w:ascii="Calibri" w:cs="Calibri" w:eastAsia="Calibri" w:hAnsi="Calibri"/>
+          <w:color w:val="23201A"/>
+          <w:sz w:val="20"/>
+          <w:szCs w:val="20"/>
+        </w:rPr>
+        <w:t xml:space="preserve"> — bewaar ontvangers en producten, zodat een volgende zending sneller klaar staat.</w:t>
+      </w:r>
+    </w:p>
+    <w:p>
+      <w:pPr>
+        <w:pStyle w:val="ListParagraph"/>
+        <w:numPr>
+          <w:ilvl w:val="0"/>
+          <w:numId w:val="2"/>
+        </w:numPr>
+        <w:spacing w:after="20"/>
+      </w:pPr>
+      <w:r>
+        <w:rPr>
+          <w:rFonts w:ascii="Calibri" w:cs="Calibri" w:eastAsia="Calibri" w:hAnsi="Calibri"/>
+          <w:b/>
+          <w:bCs/>
+          <w:color w:val="23201A"/>
+          <w:sz w:val="20"/>
+          <w:szCs w:val="20"/>
+        </w:rPr>
+        <w:t xml:space="preserve">Bulk-upload</w:t>
+      </w:r>
+      <w:r>
+        <w:rPr>
+          <w:rFonts w:ascii="Calibri" w:cs="Calibri" w:eastAsia="Calibri" w:hAnsi="Calibri"/>
+          <w:color w:val="23201A"/>
+          <w:sz w:val="20"/>
+          <w:szCs w:val="20"/>
+        </w:rPr>
+        <w:t xml:space="preserve"> — meerdere zendingen tegelijk? Plak ze als CSV, controleer de voorvertoning en maak ze in één keer aan.</w:t>
       </w:r>
     </w:p>
     <w:p>
@@ -1073,7 +1554,7 @@
           <w:sz w:val="28"/>
           <w:szCs w:val="28"/>
         </w:rPr>
-        <w:t xml:space="preserve">🧳  Ruimte aanbieden</w:t>
+        <w:t xml:space="preserve">🧳  Reiziger — ruimte aanbieden</w:t>
       </w:r>
     </w:p>
     <w:p>
@@ -1089,12 +1570,12 @@
           <w:sz w:val="20"/>
           <w:szCs w:val="20"/>
         </w:rPr>
-        <w:t xml:space="preserve">Verdien bij door pakketten mee te nemen op je reis.</w:t>
-      </w:r>
-    </w:p>
-    <w:p>
-      <w:pPr>
-        <w:spacing w:after="40" w:before="140"/>
+        <w:t xml:space="preserve">Verdien bij door op je reis pakketten mee te nemen.</w:t>
+      </w:r>
+    </w:p>
+    <w:p>
+      <w:pPr>
+        <w:spacing w:after="40" w:before="150"/>
       </w:pPr>
       <w:r>
         <w:rPr>
@@ -1105,37 +1586,67 @@
           <w:sz w:val="18"/>
           <w:szCs w:val="18"/>
         </w:rPr>
-        <w:t xml:space="preserve">1. Rit publiceren</w:t>
-      </w:r>
-    </w:p>
-    <w:p>
-      <w:pPr>
-        <w:pStyle w:val="ListParagraph"/>
-        <w:numPr>
-          <w:ilvl w:val="0"/>
-          <w:numId w:val="2"/>
-        </w:numPr>
-        <w:spacing w:after="20"/>
-      </w:pPr>
-      <w:r>
-        <w:rPr>
-          <w:rFonts w:ascii="Calibri" w:cs="Calibri" w:eastAsia="Calibri" w:hAnsi="Calibri"/>
-          <w:b/>
-          <w:bCs/>
-          <w:color w:val="23201A"/>
-          <w:sz w:val="20"/>
-          <w:szCs w:val="20"/>
-        </w:rPr>
-        <w:t xml:space="preserve">Mijn ritten → Nieuwe rit</w:t>
-      </w:r>
-      <w:r>
-        <w:rPr>
-          <w:rFonts w:ascii="Calibri" w:cs="Calibri" w:eastAsia="Calibri" w:hAnsi="Calibri"/>
-          <w:color w:val="23201A"/>
-          <w:sz w:val="20"/>
-          <w:szCs w:val="20"/>
-        </w:rPr>
-        <w:t xml:space="preserve"> — geef corridor, datum en capaciteit op.</w:t>
+        <w:t xml:space="preserve">1. Je rit publiceren</w:t>
+      </w:r>
+    </w:p>
+    <w:p>
+      <w:pPr>
+        <w:pStyle w:val="ListParagraph"/>
+        <w:numPr>
+          <w:ilvl w:val="0"/>
+          <w:numId w:val="2"/>
+        </w:numPr>
+        <w:spacing w:after="20"/>
+      </w:pPr>
+      <w:r>
+        <w:rPr>
+          <w:rFonts w:ascii="Calibri" w:cs="Calibri" w:eastAsia="Calibri" w:hAnsi="Calibri"/>
+          <w:b/>
+          <w:bCs/>
+          <w:color w:val="23201A"/>
+          <w:sz w:val="20"/>
+          <w:szCs w:val="20"/>
+        </w:rPr>
+        <w:t xml:space="preserve">Nieuwe rit</w:t>
+      </w:r>
+      <w:r>
+        <w:rPr>
+          <w:rFonts w:ascii="Calibri" w:cs="Calibri" w:eastAsia="Calibri" w:hAnsi="Calibri"/>
+          <w:color w:val="23201A"/>
+          <w:sz w:val="20"/>
+          <w:szCs w:val="20"/>
+        </w:rPr>
+        <w:t xml:space="preserve"> — ga naar “Mijn ritten” en maak een rit aan: kies de corridor, je vertrekdatum en hoeveel ruimte (kg) je hebt.</w:t>
+      </w:r>
+    </w:p>
+    <w:p>
+      <w:pPr>
+        <w:pStyle w:val="ListParagraph"/>
+        <w:numPr>
+          <w:ilvl w:val="0"/>
+          <w:numId w:val="2"/>
+        </w:numPr>
+        <w:spacing w:after="20"/>
+      </w:pPr>
+      <w:r>
+        <w:rPr>
+          <w:rFonts w:ascii="Calibri" w:cs="Calibri" w:eastAsia="Calibri" w:hAnsi="Calibri"/>
+          <w:b/>
+          <w:bCs/>
+          <w:color w:val="23201A"/>
+          <w:sz w:val="20"/>
+          <w:szCs w:val="20"/>
+        </w:rPr>
+        <w:t xml:space="preserve">Prijsindicatie</w:t>
+      </w:r>
+      <w:r>
+        <w:rPr>
+          <w:rFonts w:ascii="Calibri" w:cs="Calibri" w:eastAsia="Calibri" w:hAnsi="Calibri"/>
+          <w:color w:val="23201A"/>
+          <w:sz w:val="20"/>
+          <w:szCs w:val="20"/>
+        </w:rPr>
+        <w:t xml:space="preserve"> — geef aan wat je ongeveer wilt ontvangen; dit helpt afzenders een passend bod te doen.</w:t>
       </w:r>
     </w:p>
     <w:p>
@@ -1165,12 +1676,57 @@
           <w:sz w:val="20"/>
           <w:szCs w:val="20"/>
         </w:rPr>
-        <w:t xml:space="preserve"> — zet je rit zichtbaar (en eventueel anoniem op de publieke website).</w:t>
-      </w:r>
-    </w:p>
-    <w:p>
-      <w:pPr>
-        <w:spacing w:after="40" w:before="140"/>
+        <w:t xml:space="preserve"> — zet je rit zichtbaar op de marktplaats, en eventueel anoniem op de publieke website.</w:t>
+      </w:r>
+    </w:p>
+    <w:p>
+      <w:pPr>
+        <w:spacing w:after="140" w:before="60"/>
+      </w:pPr>
+      <w:r>
+        <w:drawing>
+          <wp:inline distT="0" distB="0" distL="0" distR="0">
+            <wp:extent cx="5334000" cy="3638550"/>
+            <wp:effectExtent t="0" r="0" b="0" l="0"/>
+            <wp:docPr id="1" name="" descr="" title=""/>
+            <wp:cNvGraphicFramePr>
+              <a:graphicFrameLocks xmlns:a="http://schemas.openxmlformats.org/drawingml/2006/main" noChangeAspect="1"/>
+            </wp:cNvGraphicFramePr>
+            <a:graphic xmlns:a="http://schemas.openxmlformats.org/drawingml/2006/main">
+              <a:graphicData uri="http://schemas.openxmlformats.org/drawingml/2006/picture">
+                <pic:pic xmlns:pic="http://schemas.openxmlformats.org/drawingml/2006/picture">
+                  <pic:nvPicPr>
+                    <pic:cNvPr id="0" name="" descr=""/>
+                    <pic:cNvPicPr>
+                      <a:picLocks noChangeAspect="1" noChangeArrowheads="1"/>
+                    </pic:cNvPicPr>
+                  </pic:nvPicPr>
+                  <pic:blipFill>
+                    <a:blip r:embed="rId12" cstate="none"/>
+                    <a:srcRect/>
+                    <a:stretch>
+                      <a:fillRect/>
+                    </a:stretch>
+                  </pic:blipFill>
+                  <pic:spPr bwMode="auto">
+                    <a:xfrm>
+                      <a:off x="0" y="0"/>
+                      <a:ext cx="5334000" cy="3638550"/>
+                    </a:xfrm>
+                    <a:prstGeom prst="rect">
+                      <a:avLst/>
+                    </a:prstGeom>
+                  </pic:spPr>
+                </pic:pic>
+              </a:graphicData>
+            </a:graphic>
+          </wp:inline>
+        </w:drawing>
+      </w:r>
+    </w:p>
+    <w:p>
+      <w:pPr>
+        <w:spacing w:after="40" w:before="150"/>
       </w:pPr>
       <w:r>
         <w:rPr>
@@ -1181,7 +1737,7 @@
           <w:sz w:val="18"/>
           <w:szCs w:val="18"/>
         </w:rPr>
-        <w:t xml:space="preserve">2. Bieden &amp; afspreken</w:t>
+        <w:t xml:space="preserve">2. Verzoeken zoeken &amp; bieden</w:t>
       </w:r>
     </w:p>
     <w:p>
@@ -1211,42 +1767,87 @@
           <w:sz w:val="20"/>
           <w:szCs w:val="20"/>
         </w:rPr>
-        <w:t xml:space="preserve"> — bekijk openstaande verzoeken en plaats een bod met een bericht.</w:t>
-      </w:r>
-    </w:p>
-    <w:p>
-      <w:pPr>
-        <w:pStyle w:val="ListParagraph"/>
-        <w:numPr>
-          <w:ilvl w:val="0"/>
-          <w:numId w:val="2"/>
-        </w:numPr>
-        <w:spacing w:after="20"/>
-      </w:pPr>
-      <w:r>
-        <w:rPr>
-          <w:rFonts w:ascii="Calibri" w:cs="Calibri" w:eastAsia="Calibri" w:hAnsi="Calibri"/>
-          <w:b/>
-          <w:bCs/>
-          <w:color w:val="23201A"/>
-          <w:sz w:val="20"/>
-          <w:szCs w:val="20"/>
-        </w:rPr>
-        <w:t xml:space="preserve">Chat</w:t>
-      </w:r>
-      <w:r>
-        <w:rPr>
-          <w:rFonts w:ascii="Calibri" w:cs="Calibri" w:eastAsia="Calibri" w:hAnsi="Calibri"/>
-          <w:color w:val="23201A"/>
-          <w:sz w:val="20"/>
-          <w:szCs w:val="20"/>
-        </w:rPr>
-        <w:t xml:space="preserve"> — stem details en prijs af; leg de afspraak vast.</w:t>
-      </w:r>
-    </w:p>
-    <w:p>
-      <w:pPr>
-        <w:spacing w:after="40" w:before="140"/>
+        <w:t xml:space="preserve"> — bekijk de openstaande verzoeken; filter op bestemming, prijs of beoordeling en sorteer zoals je wilt.</w:t>
+      </w:r>
+    </w:p>
+    <w:p>
+      <w:pPr>
+        <w:pStyle w:val="ListParagraph"/>
+        <w:numPr>
+          <w:ilvl w:val="0"/>
+          <w:numId w:val="2"/>
+        </w:numPr>
+        <w:spacing w:after="20"/>
+      </w:pPr>
+      <w:r>
+        <w:rPr>
+          <w:rFonts w:ascii="Calibri" w:cs="Calibri" w:eastAsia="Calibri" w:hAnsi="Calibri"/>
+          <w:b/>
+          <w:bCs/>
+          <w:color w:val="23201A"/>
+          <w:sz w:val="20"/>
+          <w:szCs w:val="20"/>
+        </w:rPr>
+        <w:t xml:space="preserve">Bieden</w:t>
+      </w:r>
+      <w:r>
+        <w:rPr>
+          <w:rFonts w:ascii="Calibri" w:cs="Calibri" w:eastAsia="Calibri" w:hAnsi="Calibri"/>
+          <w:color w:val="23201A"/>
+          <w:sz w:val="20"/>
+          <w:szCs w:val="20"/>
+        </w:rPr>
+        <w:t xml:space="preserve"> — open een toegestaan verzoek en plaats een bod met een kort bericht. Zo open je meteen de chat met de afzender.</w:t>
+      </w:r>
+    </w:p>
+    <w:p>
+      <w:pPr>
+        <w:spacing w:after="140" w:before="60"/>
+      </w:pPr>
+      <w:r>
+        <w:drawing>
+          <wp:inline distT="0" distB="0" distL="0" distR="0">
+            <wp:extent cx="5334000" cy="3638550"/>
+            <wp:effectExtent t="0" r="0" b="0" l="0"/>
+            <wp:docPr id="1" name="" descr="" title=""/>
+            <wp:cNvGraphicFramePr>
+              <a:graphicFrameLocks xmlns:a="http://schemas.openxmlformats.org/drawingml/2006/main" noChangeAspect="1"/>
+            </wp:cNvGraphicFramePr>
+            <a:graphic xmlns:a="http://schemas.openxmlformats.org/drawingml/2006/main">
+              <a:graphicData uri="http://schemas.openxmlformats.org/drawingml/2006/picture">
+                <pic:pic xmlns:pic="http://schemas.openxmlformats.org/drawingml/2006/picture">
+                  <pic:nvPicPr>
+                    <pic:cNvPr id="0" name="" descr=""/>
+                    <pic:cNvPicPr>
+                      <a:picLocks noChangeAspect="1" noChangeArrowheads="1"/>
+                    </pic:cNvPicPr>
+                  </pic:nvPicPr>
+                  <pic:blipFill>
+                    <a:blip r:embed="rId10" cstate="none"/>
+                    <a:srcRect/>
+                    <a:stretch>
+                      <a:fillRect/>
+                    </a:stretch>
+                  </pic:blipFill>
+                  <pic:spPr bwMode="auto">
+                    <a:xfrm>
+                      <a:off x="0" y="0"/>
+                      <a:ext cx="5334000" cy="3638550"/>
+                    </a:xfrm>
+                    <a:prstGeom prst="rect">
+                      <a:avLst/>
+                    </a:prstGeom>
+                  </pic:spPr>
+                </pic:pic>
+              </a:graphicData>
+            </a:graphic>
+          </wp:inline>
+        </w:drawing>
+      </w:r>
+    </w:p>
+    <w:p>
+      <w:pPr>
+        <w:spacing w:after="40" w:before="150"/>
       </w:pPr>
       <w:r>
         <w:rPr>
@@ -1257,72 +1858,72 @@
           <w:sz w:val="18"/>
           <w:szCs w:val="18"/>
         </w:rPr>
-        <w:t xml:space="preserve">3. Meenemen &amp; afleveren</w:t>
-      </w:r>
-    </w:p>
-    <w:p>
-      <w:pPr>
-        <w:pStyle w:val="ListParagraph"/>
-        <w:numPr>
-          <w:ilvl w:val="0"/>
-          <w:numId w:val="2"/>
-        </w:numPr>
-        <w:spacing w:after="20"/>
-      </w:pPr>
-      <w:r>
-        <w:rPr>
-          <w:rFonts w:ascii="Calibri" w:cs="Calibri" w:eastAsia="Calibri" w:hAnsi="Calibri"/>
-          <w:b/>
-          <w:bCs/>
-          <w:color w:val="23201A"/>
-          <w:sz w:val="20"/>
-          <w:szCs w:val="20"/>
-        </w:rPr>
-        <w:t xml:space="preserve">Statusstappen</w:t>
-      </w:r>
-      <w:r>
-        <w:rPr>
-          <w:rFonts w:ascii="Calibri" w:cs="Calibri" w:eastAsia="Calibri" w:hAnsi="Calibri"/>
-          <w:color w:val="23201A"/>
-          <w:sz w:val="20"/>
-          <w:szCs w:val="20"/>
-        </w:rPr>
-        <w:t xml:space="preserve"> — doorloop de stappen tot Afgeleverd.</w:t>
-      </w:r>
-    </w:p>
-    <w:p>
-      <w:pPr>
-        <w:pStyle w:val="ListParagraph"/>
-        <w:numPr>
-          <w:ilvl w:val="0"/>
-          <w:numId w:val="2"/>
-        </w:numPr>
-        <w:spacing w:after="20"/>
-      </w:pPr>
-      <w:r>
-        <w:rPr>
-          <w:rFonts w:ascii="Calibri" w:cs="Calibri" w:eastAsia="Calibri" w:hAnsi="Calibri"/>
-          <w:b/>
-          <w:bCs/>
-          <w:color w:val="23201A"/>
-          <w:sz w:val="20"/>
-          <w:szCs w:val="20"/>
-        </w:rPr>
-        <w:t xml:space="preserve">Ontvangstcode</w:t>
-      </w:r>
-      <w:r>
-        <w:rPr>
-          <w:rFonts w:ascii="Calibri" w:cs="Calibri" w:eastAsia="Calibri" w:hAnsi="Calibri"/>
-          <w:color w:val="23201A"/>
-          <w:sz w:val="20"/>
-          <w:szCs w:val="20"/>
-        </w:rPr>
-        <w:t xml:space="preserve"> — vul bij levering de code in die de ontvanger je geeft; klopt hij, dan komt je betaling vrij.</w:t>
-      </w:r>
-    </w:p>
-    <w:p>
-      <w:pPr>
-        <w:spacing w:after="40" w:before="140"/>
+        <w:t xml:space="preserve">3. Afspreken via chat</w:t>
+      </w:r>
+    </w:p>
+    <w:p>
+      <w:pPr>
+        <w:pStyle w:val="ListParagraph"/>
+        <w:numPr>
+          <w:ilvl w:val="0"/>
+          <w:numId w:val="2"/>
+        </w:numPr>
+        <w:spacing w:after="20"/>
+      </w:pPr>
+      <w:r>
+        <w:rPr>
+          <w:rFonts w:ascii="Calibri" w:cs="Calibri" w:eastAsia="Calibri" w:hAnsi="Calibri"/>
+          <w:b/>
+          <w:bCs/>
+          <w:color w:val="23201A"/>
+          <w:sz w:val="20"/>
+          <w:szCs w:val="20"/>
+        </w:rPr>
+        <w:t xml:space="preserve">Overleggen</w:t>
+      </w:r>
+      <w:r>
+        <w:rPr>
+          <w:rFonts w:ascii="Calibri" w:cs="Calibri" w:eastAsia="Calibri" w:hAnsi="Calibri"/>
+          <w:color w:val="23201A"/>
+          <w:sz w:val="20"/>
+          <w:szCs w:val="20"/>
+        </w:rPr>
+        <w:t xml:space="preserve"> — stem via de chat af wat je meeneemt, waar/wanneer je ophaalt en de prijs.</w:t>
+      </w:r>
+    </w:p>
+    <w:p>
+      <w:pPr>
+        <w:pStyle w:val="ListParagraph"/>
+        <w:numPr>
+          <w:ilvl w:val="0"/>
+          <w:numId w:val="2"/>
+        </w:numPr>
+        <w:spacing w:after="20"/>
+      </w:pPr>
+      <w:r>
+        <w:rPr>
+          <w:rFonts w:ascii="Calibri" w:cs="Calibri" w:eastAsia="Calibri" w:hAnsi="Calibri"/>
+          <w:b/>
+          <w:bCs/>
+          <w:color w:val="23201A"/>
+          <w:sz w:val="20"/>
+          <w:szCs w:val="20"/>
+        </w:rPr>
+        <w:t xml:space="preserve">Afspraak</w:t>
+      </w:r>
+      <w:r>
+        <w:rPr>
+          <w:rFonts w:ascii="Calibri" w:cs="Calibri" w:eastAsia="Calibri" w:hAnsi="Calibri"/>
+          <w:color w:val="23201A"/>
+          <w:sz w:val="20"/>
+          <w:szCs w:val="20"/>
+        </w:rPr>
+        <w:t xml:space="preserve"> — leg de afspraak vast; die blijft bovenaan staan als houvast.</w:t>
+      </w:r>
+    </w:p>
+    <w:p>
+      <w:pPr>
+        <w:spacing w:after="40" w:before="150"/>
       </w:pPr>
       <w:r>
         <w:rPr>
@@ -1333,7 +1934,83 @@
           <w:sz w:val="18"/>
           <w:szCs w:val="18"/>
         </w:rPr>
-        <w:t xml:space="preserve">4. Verdiensten</w:t>
+        <w:t xml:space="preserve">4. Meenemen &amp; afleveren met code</w:t>
+      </w:r>
+    </w:p>
+    <w:p>
+      <w:pPr>
+        <w:pStyle w:val="ListParagraph"/>
+        <w:numPr>
+          <w:ilvl w:val="0"/>
+          <w:numId w:val="2"/>
+        </w:numPr>
+        <w:spacing w:after="20"/>
+      </w:pPr>
+      <w:r>
+        <w:rPr>
+          <w:rFonts w:ascii="Calibri" w:cs="Calibri" w:eastAsia="Calibri" w:hAnsi="Calibri"/>
+          <w:b/>
+          <w:bCs/>
+          <w:color w:val="23201A"/>
+          <w:sz w:val="20"/>
+          <w:szCs w:val="20"/>
+        </w:rPr>
+        <w:t xml:space="preserve">Statusstappen</w:t>
+      </w:r>
+      <w:r>
+        <w:rPr>
+          <w:rFonts w:ascii="Calibri" w:cs="Calibri" w:eastAsia="Calibri" w:hAnsi="Calibri"/>
+          <w:color w:val="23201A"/>
+          <w:sz w:val="20"/>
+          <w:szCs w:val="20"/>
+        </w:rPr>
+        <w:t xml:space="preserve"> — doorloop de stappen tot “Afgeleverd”.</w:t>
+      </w:r>
+    </w:p>
+    <w:p>
+      <w:pPr>
+        <w:pStyle w:val="ListParagraph"/>
+        <w:numPr>
+          <w:ilvl w:val="0"/>
+          <w:numId w:val="2"/>
+        </w:numPr>
+        <w:spacing w:after="20"/>
+      </w:pPr>
+      <w:r>
+        <w:rPr>
+          <w:rFonts w:ascii="Calibri" w:cs="Calibri" w:eastAsia="Calibri" w:hAnsi="Calibri"/>
+          <w:b/>
+          <w:bCs/>
+          <w:color w:val="23201A"/>
+          <w:sz w:val="20"/>
+          <w:szCs w:val="20"/>
+        </w:rPr>
+        <w:t xml:space="preserve">Ontvangstcode</w:t>
+      </w:r>
+      <w:r>
+        <w:rPr>
+          <w:rFonts w:ascii="Calibri" w:cs="Calibri" w:eastAsia="Calibri" w:hAnsi="Calibri"/>
+          <w:color w:val="23201A"/>
+          <w:sz w:val="20"/>
+          <w:szCs w:val="20"/>
+        </w:rPr>
+        <w:t xml:space="preserve"> — vraag bij de aflevering de 6-cijferige code aan de ontvanger en vul die in. Klopt de code, dan is de levering bevestigd en komt je betaling vrij.</w:t>
+      </w:r>
+    </w:p>
+    <w:p>
+      <w:pPr>
+        <w:spacing w:after="40" w:before="150"/>
+      </w:pPr>
+      <w:r>
+        <w:rPr>
+          <w:rFonts w:ascii="Calibri" w:cs="Calibri" w:eastAsia="Calibri" w:hAnsi="Calibri"/>
+          <w:b/>
+          <w:bCs/>
+          <w:color w:val="4F7A1B"/>
+          <w:sz w:val="18"/>
+          <w:szCs w:val="18"/>
+        </w:rPr>
+        <w:t xml:space="preserve">5. Verdiensten &amp; uitbetaling</w:t>
       </w:r>
     </w:p>
     <w:p>
@@ -1363,7 +2040,7 @@
           <w:sz w:val="20"/>
           <w:szCs w:val="20"/>
         </w:rPr>
-        <w:t xml:space="preserve"> — zie je saldo en punten.</w:t>
+        <w:t xml:space="preserve"> — in je wallet zie je je saldo en je gespaarde punten.</w:t>
       </w:r>
     </w:p>
     <w:p>
@@ -1393,7 +2070,7 @@
           <w:sz w:val="20"/>
           <w:szCs w:val="20"/>
         </w:rPr>
-        <w:t xml:space="preserve"> — vraag een uitbetaling aan zodra je saldo de drempel haalt.</w:t>
+        <w:t xml:space="preserve"> — zodra je saldo de uitbetaaldrempel haalt, vraag je met één klik een uitbetaling aan; de status “in behandeling” verschijnt.</w:t>
       </w:r>
     </w:p>
     <w:p>
@@ -1423,7 +2100,52 @@
           <w:sz w:val="20"/>
           <w:szCs w:val="20"/>
         </w:rPr>
-        <w:t xml:space="preserve"> — laat een beoordeling achter voor de afzender.</w:t>
+        <w:t xml:space="preserve"> — laat na afloop een beoordeling achter voor de afzender.</w:t>
+      </w:r>
+    </w:p>
+    <w:p>
+      <w:pPr>
+        <w:spacing w:after="140" w:before="60"/>
+      </w:pPr>
+      <w:r>
+        <w:drawing>
+          <wp:inline distT="0" distB="0" distL="0" distR="0">
+            <wp:extent cx="5334000" cy="3638550"/>
+            <wp:effectExtent t="0" r="0" b="0" l="0"/>
+            <wp:docPr id="1" name="" descr="" title=""/>
+            <wp:cNvGraphicFramePr>
+              <a:graphicFrameLocks xmlns:a="http://schemas.openxmlformats.org/drawingml/2006/main" noChangeAspect="1"/>
+            </wp:cNvGraphicFramePr>
+            <a:graphic xmlns:a="http://schemas.openxmlformats.org/drawingml/2006/main">
+              <a:graphicData uri="http://schemas.openxmlformats.org/drawingml/2006/picture">
+                <pic:pic xmlns:pic="http://schemas.openxmlformats.org/drawingml/2006/picture">
+                  <pic:nvPicPr>
+                    <pic:cNvPr id="0" name="" descr=""/>
+                    <pic:cNvPicPr>
+                      <a:picLocks noChangeAspect="1" noChangeArrowheads="1"/>
+                    </pic:cNvPicPr>
+                  </pic:nvPicPr>
+                  <pic:blipFill>
+                    <a:blip r:embed="rId13" cstate="none"/>
+                    <a:srcRect/>
+                    <a:stretch>
+                      <a:fillRect/>
+                    </a:stretch>
+                  </pic:blipFill>
+                  <pic:spPr bwMode="auto">
+                    <a:xfrm>
+                      <a:off x="0" y="0"/>
+                      <a:ext cx="5334000" cy="3638550"/>
+                    </a:xfrm>
+                    <a:prstGeom prst="rect">
+                      <a:avLst/>
+                    </a:prstGeom>
+                  </pic:spPr>
+                </pic:pic>
+              </a:graphicData>
+            </a:graphic>
+          </wp:inline>
+        </w:drawing>
       </w:r>
     </w:p>
     <w:p>
@@ -1457,7 +2179,7 @@
           <w:sz w:val="28"/>
           <w:szCs w:val="28"/>
         </w:rPr>
-        <w:t xml:space="preserve">🏭  Verwerking</w:t>
+        <w:t xml:space="preserve">🏭  Hub / operatie — verwerking</w:t>
       </w:r>
     </w:p>
     <w:p>
@@ -1473,12 +2195,12 @@
           <w:sz w:val="20"/>
           <w:szCs w:val="20"/>
         </w:rPr>
-        <w:t xml:space="preserve">Intake, inspectie, custody en transport.</w:t>
-      </w:r>
-    </w:p>
-    <w:p>
-      <w:pPr>
-        <w:spacing w:after="40" w:before="140"/>
+        <w:t xml:space="preserve">Intake, inspectie, verzegeling, custody en transport.</w:t>
+      </w:r>
+    </w:p>
+    <w:p>
+      <w:pPr>
+        <w:spacing w:after="40" w:before="150"/>
       </w:pPr>
       <w:r>
         <w:rPr>
@@ -1510,16 +2232,46 @@
           <w:sz w:val="20"/>
           <w:szCs w:val="20"/>
         </w:rPr>
-        <w:t xml:space="preserve">Inspecteren</w:t>
-      </w:r>
-      <w:r>
-        <w:rPr>
-          <w:rFonts w:ascii="Calibri" w:cs="Calibri" w:eastAsia="Calibri" w:hAnsi="Calibri"/>
-          <w:color w:val="23201A"/>
-          <w:sz w:val="20"/>
-          <w:szCs w:val="20"/>
-        </w:rPr>
-        <w:t xml:space="preserve"> — loop de checklist na en verzegel met een zegelnummer.</w:t>
+        <w:t xml:space="preserve">Inspectie</w:t>
+      </w:r>
+      <w:r>
+        <w:rPr>
+          <w:rFonts w:ascii="Calibri" w:cs="Calibri" w:eastAsia="Calibri" w:hAnsi="Calibri"/>
+          <w:color w:val="23201A"/>
+          <w:sz w:val="20"/>
+          <w:szCs w:val="20"/>
+        </w:rPr>
+        <w:t xml:space="preserve"> — loop bij een geboekte zending de checklist na (inhoud, aantal, staat, batterijen, vloeistoffen, aangifte).</w:t>
+      </w:r>
+    </w:p>
+    <w:p>
+      <w:pPr>
+        <w:pStyle w:val="ListParagraph"/>
+        <w:numPr>
+          <w:ilvl w:val="0"/>
+          <w:numId w:val="2"/>
+        </w:numPr>
+        <w:spacing w:after="20"/>
+      </w:pPr>
+      <w:r>
+        <w:rPr>
+          <w:rFonts w:ascii="Calibri" w:cs="Calibri" w:eastAsia="Calibri" w:hAnsi="Calibri"/>
+          <w:b/>
+          <w:bCs/>
+          <w:color w:val="23201A"/>
+          <w:sz w:val="20"/>
+          <w:szCs w:val="20"/>
+        </w:rPr>
+        <w:t xml:space="preserve">Verzegelen</w:t>
+      </w:r>
+      <w:r>
+        <w:rPr>
+          <w:rFonts w:ascii="Calibri" w:cs="Calibri" w:eastAsia="Calibri" w:hAnsi="Calibri"/>
+          <w:color w:val="23201A"/>
+          <w:sz w:val="20"/>
+          <w:szCs w:val="20"/>
+        </w:rPr>
+        <w:t xml:space="preserve"> — geef een zegelnummer op en verzegel; de zending gaat naar de volgende status.</w:t>
       </w:r>
     </w:p>
     <w:p>
@@ -1549,12 +2301,12 @@
           <w:sz w:val="20"/>
           <w:szCs w:val="20"/>
         </w:rPr>
-        <w:t xml:space="preserve"> — elke overdracht wordt vastgelegd en is niet te wijzigen.</w:t>
-      </w:r>
-    </w:p>
-    <w:p>
-      <w:pPr>
-        <w:spacing w:after="40" w:before="140"/>
+        <w:t xml:space="preserve"> — elke stap en overdracht wordt vastgelegd in een onwijzigbaar logboek.</w:t>
+      </w:r>
+    </w:p>
+    <w:p>
+      <w:pPr>
+        <w:spacing w:after="40" w:before="150"/>
       </w:pPr>
       <w:r>
         <w:rPr>
@@ -1565,7 +2317,7 @@
           <w:sz w:val="18"/>
           <w:szCs w:val="18"/>
         </w:rPr>
-        <w:t xml:space="preserve">Transport</w:t>
+        <w:t xml:space="preserve">Manifesten, legs, lockers</w:t>
       </w:r>
     </w:p>
     <w:p>
@@ -1595,7 +2347,7 @@
           <w:sz w:val="20"/>
           <w:szCs w:val="20"/>
         </w:rPr>
-        <w:t xml:space="preserve"> — maak een manifest, koppel zendingen en zet de status door.</w:t>
+        <w:t xml:space="preserve"> — maak een manifest (bv. een vlucht), koppel er zendingen aan en zet de status door: verzegelen → vertrek → aankomst → sluiten. Alle gekoppelde zendingen lopen mee.</w:t>
       </w:r>
     </w:p>
     <w:p>
@@ -1625,12 +2377,12 @@
           <w:sz w:val="20"/>
           <w:szCs w:val="20"/>
         </w:rPr>
-        <w:t xml:space="preserve"> — wijs een pakket toe aan een compartiment (met pin), boek een tijdslot en doe een voorraad-reconciliatie.</w:t>
-      </w:r>
-    </w:p>
-    <w:p>
-      <w:pPr>
-        <w:spacing w:after="40" w:before="140"/>
+        <w:t xml:space="preserve"> — wijs een pakket toe aan een vrij compartiment (met pincode), boek een tijdslot en voer een voorraad-reconciliatie uit (scannen → MATCH / ONVERWACHT / ONTBREEKT).</w:t>
+      </w:r>
+    </w:p>
+    <w:p>
+      <w:pPr>
+        <w:spacing w:after="40" w:before="150"/>
       </w:pPr>
       <w:r>
         <w:rPr>
@@ -1641,7 +2393,7 @@
           <w:sz w:val="18"/>
           <w:szCs w:val="18"/>
         </w:rPr>
-        <w:t xml:space="preserve">Beoordeling</w:t>
+        <w:t xml:space="preserve">Beoordelingswachtrij</w:t>
       </w:r>
     </w:p>
     <w:p>
@@ -1671,7 +2423,52 @@
           <w:sz w:val="20"/>
           <w:szCs w:val="20"/>
         </w:rPr>
-        <w:t xml:space="preserve"> — behandel de beoordelingswachtrij en keur zendingen goed of af.</w:t>
+        <w:t xml:space="preserve"> — behandel de wachtrij met zendingen die beoordeling nodig hebben en keur ze goed of af.</w:t>
+      </w:r>
+    </w:p>
+    <w:p>
+      <w:pPr>
+        <w:spacing w:after="140" w:before="60"/>
+      </w:pPr>
+      <w:r>
+        <w:drawing>
+          <wp:inline distT="0" distB="0" distL="0" distR="0">
+            <wp:extent cx="5334000" cy="3638550"/>
+            <wp:effectExtent t="0" r="0" b="0" l="0"/>
+            <wp:docPr id="1" name="" descr="" title=""/>
+            <wp:cNvGraphicFramePr>
+              <a:graphicFrameLocks xmlns:a="http://schemas.openxmlformats.org/drawingml/2006/main" noChangeAspect="1"/>
+            </wp:cNvGraphicFramePr>
+            <a:graphic xmlns:a="http://schemas.openxmlformats.org/drawingml/2006/main">
+              <a:graphicData uri="http://schemas.openxmlformats.org/drawingml/2006/picture">
+                <pic:pic xmlns:pic="http://schemas.openxmlformats.org/drawingml/2006/picture">
+                  <pic:nvPicPr>
+                    <pic:cNvPr id="0" name="" descr=""/>
+                    <pic:cNvPicPr>
+                      <a:picLocks noChangeAspect="1" noChangeArrowheads="1"/>
+                    </pic:cNvPicPr>
+                  </pic:nvPicPr>
+                  <pic:blipFill>
+                    <a:blip r:embed="rId14" cstate="none"/>
+                    <a:srcRect/>
+                    <a:stretch>
+                      <a:fillRect/>
+                    </a:stretch>
+                  </pic:blipFill>
+                  <pic:spPr bwMode="auto">
+                    <a:xfrm>
+                      <a:off x="0" y="0"/>
+                      <a:ext cx="5334000" cy="3638550"/>
+                    </a:xfrm>
+                    <a:prstGeom prst="rect">
+                      <a:avLst/>
+                    </a:prstGeom>
+                  </pic:spPr>
+                </pic:pic>
+              </a:graphicData>
+            </a:graphic>
+          </wp:inline>
+        </w:drawing>
       </w:r>
     </w:p>
     <w:p>
@@ -1705,7 +2502,7 @@
           <w:sz w:val="28"/>
           <w:szCs w:val="28"/>
         </w:rPr>
-        <w:t xml:space="preserve">🛡️  Sturing &amp; toezicht</w:t>
+        <w:t xml:space="preserve">🛡️  Beheer — sturing &amp; toezicht</w:t>
       </w:r>
     </w:p>
     <w:p>
@@ -1721,12 +2518,12 @@
           <w:sz w:val="20"/>
           <w:szCs w:val="20"/>
         </w:rPr>
-        <w:t xml:space="preserve">Overzicht, veiligheid, inzicht en content.</w:t>
-      </w:r>
-    </w:p>
-    <w:p>
-      <w:pPr>
-        <w:spacing w:after="40" w:before="140"/>
+        <w:t xml:space="preserve">Overzicht, veiligheid, inzicht in gebruik, en content.</w:t>
+      </w:r>
+    </w:p>
+    <w:p>
+      <w:pPr>
+        <w:spacing w:after="40" w:before="150"/>
       </w:pPr>
       <w:r>
         <w:rPr>
@@ -1737,72 +2534,147 @@
           <w:sz w:val="18"/>
           <w:szCs w:val="18"/>
         </w:rPr>
-        <w:t xml:space="preserve">Toezicht &amp; veiligheid</w:t>
-      </w:r>
-    </w:p>
-    <w:p>
-      <w:pPr>
-        <w:pStyle w:val="ListParagraph"/>
-        <w:numPr>
-          <w:ilvl w:val="0"/>
-          <w:numId w:val="2"/>
-        </w:numPr>
-        <w:spacing w:after="20"/>
-      </w:pPr>
-      <w:r>
-        <w:rPr>
-          <w:rFonts w:ascii="Calibri" w:cs="Calibri" w:eastAsia="Calibri" w:hAnsi="Calibri"/>
-          <w:b/>
-          <w:bCs/>
-          <w:color w:val="23201A"/>
-          <w:sz w:val="20"/>
-          <w:szCs w:val="20"/>
-        </w:rPr>
-        <w:t xml:space="preserve">Control Center</w:t>
-      </w:r>
-      <w:r>
-        <w:rPr>
-          <w:rFonts w:ascii="Calibri" w:cs="Calibri" w:eastAsia="Calibri" w:hAnsi="Calibri"/>
-          <w:color w:val="23201A"/>
-          <w:sz w:val="20"/>
-          <w:szCs w:val="20"/>
-        </w:rPr>
-        <w:t xml:space="preserve"> — beoordeel zendingen, zet een kill switch per corridor, handel meldingen af.</w:t>
-      </w:r>
-    </w:p>
-    <w:p>
-      <w:pPr>
-        <w:pStyle w:val="ListParagraph"/>
-        <w:numPr>
-          <w:ilvl w:val="0"/>
-          <w:numId w:val="2"/>
-        </w:numPr>
-        <w:spacing w:after="20"/>
-      </w:pPr>
-      <w:r>
-        <w:rPr>
-          <w:rFonts w:ascii="Calibri" w:cs="Calibri" w:eastAsia="Calibri" w:hAnsi="Calibri"/>
-          <w:b/>
-          <w:bCs/>
-          <w:color w:val="23201A"/>
-          <w:sz w:val="20"/>
-          <w:szCs w:val="20"/>
-        </w:rPr>
-        <w:t xml:space="preserve">Testfeedback</w:t>
-      </w:r>
-      <w:r>
-        <w:rPr>
-          <w:rFonts w:ascii="Calibri" w:cs="Calibri" w:eastAsia="Calibri" w:hAnsi="Calibri"/>
-          <w:color w:val="23201A"/>
-          <w:sz w:val="20"/>
-          <w:szCs w:val="20"/>
-        </w:rPr>
-        <w:t xml:space="preserve"> — alle ingestuurde feedback komt hier gebundeld binnen, met gebruiker + pagina.</w:t>
-      </w:r>
-    </w:p>
-    <w:p>
-      <w:pPr>
-        <w:spacing w:after="40" w:before="140"/>
+        <w:t xml:space="preserve">Control Center: toezicht &amp; veiligheid</w:t>
+      </w:r>
+    </w:p>
+    <w:p>
+      <w:pPr>
+        <w:pStyle w:val="ListParagraph"/>
+        <w:numPr>
+          <w:ilvl w:val="0"/>
+          <w:numId w:val="2"/>
+        </w:numPr>
+        <w:spacing w:after="20"/>
+      </w:pPr>
+      <w:r>
+        <w:rPr>
+          <w:rFonts w:ascii="Calibri" w:cs="Calibri" w:eastAsia="Calibri" w:hAnsi="Calibri"/>
+          <w:b/>
+          <w:bCs/>
+          <w:color w:val="23201A"/>
+          <w:sz w:val="20"/>
+          <w:szCs w:val="20"/>
+        </w:rPr>
+        <w:t xml:space="preserve">Beoordelen</w:t>
+      </w:r>
+      <w:r>
+        <w:rPr>
+          <w:rFonts w:ascii="Calibri" w:cs="Calibri" w:eastAsia="Calibri" w:hAnsi="Calibri"/>
+          <w:color w:val="23201A"/>
+          <w:sz w:val="20"/>
+          <w:szCs w:val="20"/>
+        </w:rPr>
+        <w:t xml:space="preserve"> — werk de beoordelingswachtrij af; overrule met een reden waar nodig.</w:t>
+      </w:r>
+    </w:p>
+    <w:p>
+      <w:pPr>
+        <w:pStyle w:val="ListParagraph"/>
+        <w:numPr>
+          <w:ilvl w:val="0"/>
+          <w:numId w:val="2"/>
+        </w:numPr>
+        <w:spacing w:after="20"/>
+      </w:pPr>
+      <w:r>
+        <w:rPr>
+          <w:rFonts w:ascii="Calibri" w:cs="Calibri" w:eastAsia="Calibri" w:hAnsi="Calibri"/>
+          <w:b/>
+          <w:bCs/>
+          <w:color w:val="23201A"/>
+          <w:sz w:val="20"/>
+          <w:szCs w:val="20"/>
+        </w:rPr>
+        <w:t xml:space="preserve">Kill switch</w:t>
+      </w:r>
+      <w:r>
+        <w:rPr>
+          <w:rFonts w:ascii="Calibri" w:cs="Calibri" w:eastAsia="Calibri" w:hAnsi="Calibri"/>
+          <w:color w:val="23201A"/>
+          <w:sz w:val="20"/>
+          <w:szCs w:val="20"/>
+        </w:rPr>
+        <w:t xml:space="preserve"> — zet per corridor een noodstop als dat moet.</w:t>
+      </w:r>
+    </w:p>
+    <w:p>
+      <w:pPr>
+        <w:pStyle w:val="ListParagraph"/>
+        <w:numPr>
+          <w:ilvl w:val="0"/>
+          <w:numId w:val="2"/>
+        </w:numPr>
+        <w:spacing w:after="20"/>
+      </w:pPr>
+      <w:r>
+        <w:rPr>
+          <w:rFonts w:ascii="Calibri" w:cs="Calibri" w:eastAsia="Calibri" w:hAnsi="Calibri"/>
+          <w:b/>
+          <w:bCs/>
+          <w:color w:val="23201A"/>
+          <w:sz w:val="20"/>
+          <w:szCs w:val="20"/>
+        </w:rPr>
+        <w:t xml:space="preserve">Meldingen</w:t>
+      </w:r>
+      <w:r>
+        <w:rPr>
+          <w:rFonts w:ascii="Calibri" w:cs="Calibri" w:eastAsia="Calibri" w:hAnsi="Calibri"/>
+          <w:color w:val="23201A"/>
+          <w:sz w:val="20"/>
+          <w:szCs w:val="20"/>
+        </w:rPr>
+        <w:t xml:space="preserve"> — handel 🚩 gerapporteerde gebruikers/listings af.</w:t>
+      </w:r>
+    </w:p>
+    <w:p>
+      <w:pPr>
+        <w:spacing w:after="140" w:before="60"/>
+      </w:pPr>
+      <w:r>
+        <w:drawing>
+          <wp:inline distT="0" distB="0" distL="0" distR="0">
+            <wp:extent cx="5334000" cy="3638550"/>
+            <wp:effectExtent t="0" r="0" b="0" l="0"/>
+            <wp:docPr id="1" name="" descr="" title=""/>
+            <wp:cNvGraphicFramePr>
+              <a:graphicFrameLocks xmlns:a="http://schemas.openxmlformats.org/drawingml/2006/main" noChangeAspect="1"/>
+            </wp:cNvGraphicFramePr>
+            <a:graphic xmlns:a="http://schemas.openxmlformats.org/drawingml/2006/main">
+              <a:graphicData uri="http://schemas.openxmlformats.org/drawingml/2006/picture">
+                <pic:pic xmlns:pic="http://schemas.openxmlformats.org/drawingml/2006/picture">
+                  <pic:nvPicPr>
+                    <pic:cNvPr id="0" name="" descr=""/>
+                    <pic:cNvPicPr>
+                      <a:picLocks noChangeAspect="1" noChangeArrowheads="1"/>
+                    </pic:cNvPicPr>
+                  </pic:nvPicPr>
+                  <pic:blipFill>
+                    <a:blip r:embed="rId14" cstate="none"/>
+                    <a:srcRect/>
+                    <a:stretch>
+                      <a:fillRect/>
+                    </a:stretch>
+                  </pic:blipFill>
+                  <pic:spPr bwMode="auto">
+                    <a:xfrm>
+                      <a:off x="0" y="0"/>
+                      <a:ext cx="5334000" cy="3638550"/>
+                    </a:xfrm>
+                    <a:prstGeom prst="rect">
+                      <a:avLst/>
+                    </a:prstGeom>
+                  </pic:spPr>
+                </pic:pic>
+              </a:graphicData>
+            </a:graphic>
+          </wp:inline>
+        </w:drawing>
+      </w:r>
+    </w:p>
+    <w:p>
+      <w:pPr>
+        <w:spacing w:after="40" w:before="150"/>
       </w:pPr>
       <w:r>
         <w:rPr>
@@ -1813,72 +2685,117 @@
           <w:sz w:val="18"/>
           <w:szCs w:val="18"/>
         </w:rPr>
-        <w:t xml:space="preserve">Inzicht</w:t>
-      </w:r>
-    </w:p>
-    <w:p>
-      <w:pPr>
-        <w:pStyle w:val="ListParagraph"/>
-        <w:numPr>
-          <w:ilvl w:val="0"/>
-          <w:numId w:val="2"/>
-        </w:numPr>
-        <w:spacing w:after="20"/>
-      </w:pPr>
-      <w:r>
-        <w:rPr>
-          <w:rFonts w:ascii="Calibri" w:cs="Calibri" w:eastAsia="Calibri" w:hAnsi="Calibri"/>
-          <w:b/>
-          <w:bCs/>
-          <w:color w:val="23201A"/>
-          <w:sz w:val="20"/>
-          <w:szCs w:val="20"/>
-        </w:rPr>
-        <w:t xml:space="preserve">Gebruik &amp; activiteit</w:t>
-      </w:r>
-      <w:r>
-        <w:rPr>
-          <w:rFonts w:ascii="Calibri" w:cs="Calibri" w:eastAsia="Calibri" w:hAnsi="Calibri"/>
-          <w:color w:val="23201A"/>
-          <w:sz w:val="20"/>
-          <w:szCs w:val="20"/>
-        </w:rPr>
-        <w:t xml:space="preserve"> — actieve gebruikers, wie er actief is geweest, trechter en gedrag (paginaweergaven, check, kliks).</w:t>
-      </w:r>
-    </w:p>
-    <w:p>
-      <w:pPr>
-        <w:pStyle w:val="ListParagraph"/>
-        <w:numPr>
-          <w:ilvl w:val="0"/>
-          <w:numId w:val="2"/>
-        </w:numPr>
-        <w:spacing w:after="20"/>
-      </w:pPr>
-      <w:r>
-        <w:rPr>
-          <w:rFonts w:ascii="Calibri" w:cs="Calibri" w:eastAsia="Calibri" w:hAnsi="Calibri"/>
-          <w:b/>
-          <w:bCs/>
-          <w:color w:val="23201A"/>
-          <w:sz w:val="20"/>
-          <w:szCs w:val="20"/>
-        </w:rPr>
-        <w:t xml:space="preserve">Analytics</w:t>
-      </w:r>
-      <w:r>
-        <w:rPr>
-          <w:rFonts w:ascii="Calibri" w:cs="Calibri" w:eastAsia="Calibri" w:hAnsi="Calibri"/>
-          <w:color w:val="23201A"/>
-          <w:sz w:val="20"/>
-          <w:szCs w:val="20"/>
-        </w:rPr>
-        <w:t xml:space="preserve"> — stuurinformatie en unit-economics.</w:t>
-      </w:r>
-    </w:p>
-    <w:p>
-      <w:pPr>
-        <w:spacing w:after="40" w:before="140"/>
+        <w:t xml:space="preserve">Gebruik &amp; activiteit (dashboard)</w:t>
+      </w:r>
+    </w:p>
+    <w:p>
+      <w:pPr>
+        <w:pStyle w:val="ListParagraph"/>
+        <w:numPr>
+          <w:ilvl w:val="0"/>
+          <w:numId w:val="2"/>
+        </w:numPr>
+        <w:spacing w:after="20"/>
+      </w:pPr>
+      <w:r>
+        <w:rPr>
+          <w:rFonts w:ascii="Calibri" w:cs="Calibri" w:eastAsia="Calibri" w:hAnsi="Calibri"/>
+          <w:b/>
+          <w:bCs/>
+          <w:color w:val="23201A"/>
+          <w:sz w:val="20"/>
+          <w:szCs w:val="20"/>
+        </w:rPr>
+        <w:t xml:space="preserve">Actieve gebruikers</w:t>
+      </w:r>
+      <w:r>
+        <w:rPr>
+          <w:rFonts w:ascii="Calibri" w:cs="Calibri" w:eastAsia="Calibri" w:hAnsi="Calibri"/>
+          <w:color w:val="23201A"/>
+          <w:sz w:val="20"/>
+          <w:szCs w:val="20"/>
+        </w:rPr>
+        <w:t xml:space="preserve"> — zie hoeveel mensen actief zijn (24u/7d/30d) en wie er actief is geweest, met laatste login en aantal acties per lid.</w:t>
+      </w:r>
+    </w:p>
+    <w:p>
+      <w:pPr>
+        <w:pStyle w:val="ListParagraph"/>
+        <w:numPr>
+          <w:ilvl w:val="0"/>
+          <w:numId w:val="2"/>
+        </w:numPr>
+        <w:spacing w:after="20"/>
+      </w:pPr>
+      <w:r>
+        <w:rPr>
+          <w:rFonts w:ascii="Calibri" w:cs="Calibri" w:eastAsia="Calibri" w:hAnsi="Calibri"/>
+          <w:b/>
+          <w:bCs/>
+          <w:color w:val="23201A"/>
+          <w:sz w:val="20"/>
+          <w:szCs w:val="20"/>
+        </w:rPr>
+        <w:t xml:space="preserve">Trechter &amp; gedrag</w:t>
+      </w:r>
+      <w:r>
+        <w:rPr>
+          <w:rFonts w:ascii="Calibri" w:cs="Calibri" w:eastAsia="Calibri" w:hAnsi="Calibri"/>
+          <w:color w:val="23201A"/>
+          <w:sz w:val="20"/>
+          <w:szCs w:val="20"/>
+        </w:rPr>
+        <w:t xml:space="preserve"> — volg de activiteitstrechter (registratie → … → levering) en het gedrag (paginaweergaven, “check gebruikt”, kliks).</w:t>
+      </w:r>
+    </w:p>
+    <w:p>
+      <w:pPr>
+        <w:spacing w:after="140" w:before="60"/>
+      </w:pPr>
+      <w:r>
+        <w:drawing>
+          <wp:inline distT="0" distB="0" distL="0" distR="0">
+            <wp:extent cx="5334000" cy="3638550"/>
+            <wp:effectExtent t="0" r="0" b="0" l="0"/>
+            <wp:docPr id="1" name="" descr="" title=""/>
+            <wp:cNvGraphicFramePr>
+              <a:graphicFrameLocks xmlns:a="http://schemas.openxmlformats.org/drawingml/2006/main" noChangeAspect="1"/>
+            </wp:cNvGraphicFramePr>
+            <a:graphic xmlns:a="http://schemas.openxmlformats.org/drawingml/2006/main">
+              <a:graphicData uri="http://schemas.openxmlformats.org/drawingml/2006/picture">
+                <pic:pic xmlns:pic="http://schemas.openxmlformats.org/drawingml/2006/picture">
+                  <pic:nvPicPr>
+                    <pic:cNvPr id="0" name="" descr=""/>
+                    <pic:cNvPicPr>
+                      <a:picLocks noChangeAspect="1" noChangeArrowheads="1"/>
+                    </pic:cNvPicPr>
+                  </pic:nvPicPr>
+                  <pic:blipFill>
+                    <a:blip r:embed="rId15" cstate="none"/>
+                    <a:srcRect/>
+                    <a:stretch>
+                      <a:fillRect/>
+                    </a:stretch>
+                  </pic:blipFill>
+                  <pic:spPr bwMode="auto">
+                    <a:xfrm>
+                      <a:off x="0" y="0"/>
+                      <a:ext cx="5334000" cy="3638550"/>
+                    </a:xfrm>
+                    <a:prstGeom prst="rect">
+                      <a:avLst/>
+                    </a:prstGeom>
+                  </pic:spPr>
+                </pic:pic>
+              </a:graphicData>
+            </a:graphic>
+          </wp:inline>
+        </w:drawing>
+      </w:r>
+    </w:p>
+    <w:p>
+      <w:pPr>
+        <w:spacing w:after="40" w:before="150"/>
       </w:pPr>
       <w:r>
         <w:rPr>
@@ -1889,7 +2806,37 @@
           <w:sz w:val="18"/>
           <w:szCs w:val="18"/>
         </w:rPr>
-        <w:t xml:space="preserve">Beheer &amp; content</w:t>
+        <w:t xml:space="preserve">Feedback, simulaties &amp; content</w:t>
+      </w:r>
+    </w:p>
+    <w:p>
+      <w:pPr>
+        <w:pStyle w:val="ListParagraph"/>
+        <w:numPr>
+          <w:ilvl w:val="0"/>
+          <w:numId w:val="2"/>
+        </w:numPr>
+        <w:spacing w:after="20"/>
+      </w:pPr>
+      <w:r>
+        <w:rPr>
+          <w:rFonts w:ascii="Calibri" w:cs="Calibri" w:eastAsia="Calibri" w:hAnsi="Calibri"/>
+          <w:b/>
+          <w:bCs/>
+          <w:color w:val="23201A"/>
+          <w:sz w:val="20"/>
+          <w:szCs w:val="20"/>
+        </w:rPr>
+        <w:t xml:space="preserve">Testfeedback</w:t>
+      </w:r>
+      <w:r>
+        <w:rPr>
+          <w:rFonts w:ascii="Calibri" w:cs="Calibri" w:eastAsia="Calibri" w:hAnsi="Calibri"/>
+          <w:color w:val="23201A"/>
+          <w:sz w:val="20"/>
+          <w:szCs w:val="20"/>
+        </w:rPr>
+        <w:t xml:space="preserve"> — alle ingestuurde feedback komt gebundeld binnen in het Control Center, met gebruiker + pagina.</w:t>
       </w:r>
     </w:p>
     <w:p>
@@ -1919,37 +2866,37 @@
           <w:sz w:val="20"/>
           <w:szCs w:val="20"/>
         </w:rPr>
-        <w:t xml:space="preserve"> — stuur de simulaties aan (betaling, verificatie).</w:t>
-      </w:r>
-    </w:p>
-    <w:p>
-      <w:pPr>
-        <w:pStyle w:val="ListParagraph"/>
-        <w:numPr>
-          <w:ilvl w:val="0"/>
-          <w:numId w:val="2"/>
-        </w:numPr>
-        <w:spacing w:after="20"/>
-      </w:pPr>
-      <w:r>
-        <w:rPr>
-          <w:rFonts w:ascii="Calibri" w:cs="Calibri" w:eastAsia="Calibri" w:hAnsi="Calibri"/>
-          <w:b/>
-          <w:bCs/>
-          <w:color w:val="23201A"/>
-          <w:sz w:val="20"/>
-          <w:szCs w:val="20"/>
-        </w:rPr>
-        <w:t xml:space="preserve">Content &amp; video's, advertenties, leden</w:t>
-      </w:r>
-      <w:r>
-        <w:rPr>
-          <w:rFonts w:ascii="Calibri" w:cs="Calibri" w:eastAsia="Calibri" w:hAnsi="Calibri"/>
-          <w:color w:val="23201A"/>
-          <w:sz w:val="20"/>
-          <w:szCs w:val="20"/>
-        </w:rPr>
-        <w:t xml:space="preserve"> — beheer wat er op de site verschijnt en wie toegang heeft.</w:t>
+        <w:t xml:space="preserve"> — stuur de simulaties aan (betaling laten slagen, verificatie goedkeuren) tijdens het testen.</w:t>
+      </w:r>
+    </w:p>
+    <w:p>
+      <w:pPr>
+        <w:pStyle w:val="ListParagraph"/>
+        <w:numPr>
+          <w:ilvl w:val="0"/>
+          <w:numId w:val="2"/>
+        </w:numPr>
+        <w:spacing w:after="20"/>
+      </w:pPr>
+      <w:r>
+        <w:rPr>
+          <w:rFonts w:ascii="Calibri" w:cs="Calibri" w:eastAsia="Calibri" w:hAnsi="Calibri"/>
+          <w:b/>
+          <w:bCs/>
+          <w:color w:val="23201A"/>
+          <w:sz w:val="20"/>
+          <w:szCs w:val="20"/>
+        </w:rPr>
+        <w:t xml:space="preserve">Content &amp; leden</w:t>
+      </w:r>
+      <w:r>
+        <w:rPr>
+          <w:rFonts w:ascii="Calibri" w:cs="Calibri" w:eastAsia="Calibri" w:hAnsi="Calibri"/>
+          <w:color w:val="23201A"/>
+          <w:sz w:val="20"/>
+          <w:szCs w:val="20"/>
+        </w:rPr>
+        <w:t xml:space="preserve"> — beheer video's/advertenties en nodig leden uit of verban ze.</w:t>
       </w:r>
     </w:p>
     <w:p>

</xml_diff>